<commit_message>
Updated Big O of Sorts notes
</commit_message>
<xml_diff>
--- a/u10c_bigO_Sorts_Collections/notes/Big-O all data structures.docx
+++ b/u10c_bigO_Sorts_Collections/notes/Big-O all data structures.docx
@@ -1,6 +1,6 @@
 
 <file path=word/document.xml><?xml version="1.0" encoding="utf-8"?>
-<w:document xmlns:wpc="http://schemas.microsoft.com/office/word/2010/wordprocessingCanvas" xmlns:cx="http://schemas.microsoft.com/office/drawing/2014/chartex" xmlns:cx1="http://schemas.microsoft.com/office/drawing/2015/9/8/chartex" xmlns:cx2="http://schemas.microsoft.com/office/drawing/2015/10/21/chartex" xmlns:cx3="http://schemas.microsoft.com/office/drawing/2016/5/9/chartex" xmlns:cx4="http://schemas.microsoft.com/office/drawing/2016/5/10/chartex" xmlns:cx5="http://schemas.microsoft.com/office/drawing/2016/5/11/chartex" xmlns:cx6="http://schemas.microsoft.com/office/drawing/2016/5/12/chartex" xmlns:cx7="http://schemas.microsoft.com/office/drawing/2016/5/13/chartex" xmlns:cx8="http://schemas.microsoft.com/office/drawing/2016/5/14/chartex" xmlns:mc="http://schemas.openxmlformats.org/markup-compatibility/2006" xmlns:aink="http://schemas.microsoft.com/office/drawing/2016/ink" xmlns:am3d="http://schemas.microsoft.com/office/drawing/2017/model3d" xmlns:o="urn:schemas-microsoft-com:office:office" xmlns:r="http://schemas.openxmlformats.org/officeDocument/2006/relationships" xmlns:m="http://schemas.openxmlformats.org/officeDocument/2006/math" xmlns:v="urn:schemas-microsoft-com:vml" xmlns:wp14="http://schemas.microsoft.com/office/word/2010/wordprocessingDrawing" xmlns:wp="http://schemas.openxmlformats.org/drawingml/2006/wordprocessingDrawing" xmlns:w10="urn:schemas-microsoft-com:office:word" xmlns:w="http://schemas.openxmlformats.org/wordprocessingml/2006/main" xmlns:w14="http://schemas.microsoft.com/office/word/2010/wordml" xmlns:w15="http://schemas.microsoft.com/office/word/2012/wordml" xmlns:w16cex="http://schemas.microsoft.com/office/word/2018/wordml/cex" xmlns:w16cid="http://schemas.microsoft.com/office/word/2016/wordml/cid" xmlns:w16="http://schemas.microsoft.com/office/word/2018/wordml" xmlns:w16se="http://schemas.microsoft.com/office/word/2015/wordml/symex" xmlns:wpg="http://schemas.microsoft.com/office/word/2010/wordprocessingGroup" xmlns:wpi="http://schemas.microsoft.com/office/word/2010/wordprocessingInk" xmlns:wne="http://schemas.microsoft.com/office/word/2006/wordml" xmlns:wps="http://schemas.microsoft.com/office/word/2010/wordprocessingShape" mc:Ignorable="w14 w15 w16se w16cid w16 w16cex wp14">
+<w:document xmlns:wpc="http://schemas.microsoft.com/office/word/2010/wordprocessingCanvas" xmlns:cx="http://schemas.microsoft.com/office/drawing/2014/chartex" xmlns:cx1="http://schemas.microsoft.com/office/drawing/2015/9/8/chartex" xmlns:cx2="http://schemas.microsoft.com/office/drawing/2015/10/21/chartex" xmlns:cx3="http://schemas.microsoft.com/office/drawing/2016/5/9/chartex" xmlns:cx4="http://schemas.microsoft.com/office/drawing/2016/5/10/chartex" xmlns:cx5="http://schemas.microsoft.com/office/drawing/2016/5/11/chartex" xmlns:cx6="http://schemas.microsoft.com/office/drawing/2016/5/12/chartex" xmlns:cx7="http://schemas.microsoft.com/office/drawing/2016/5/13/chartex" xmlns:cx8="http://schemas.microsoft.com/office/drawing/2016/5/14/chartex" xmlns:mc="http://schemas.openxmlformats.org/markup-compatibility/2006" xmlns:aink="http://schemas.microsoft.com/office/drawing/2016/ink" xmlns:am3d="http://schemas.microsoft.com/office/drawing/2017/model3d" xmlns:o="urn:schemas-microsoft-com:office:office" xmlns:r="http://schemas.openxmlformats.org/officeDocument/2006/relationships" xmlns:m="http://schemas.openxmlformats.org/officeDocument/2006/math" xmlns:v="urn:schemas-microsoft-com:vml" xmlns:wp14="http://schemas.microsoft.com/office/word/2010/wordprocessingDrawing" xmlns:wp="http://schemas.openxmlformats.org/drawingml/2006/wordprocessingDrawing" xmlns:w10="urn:schemas-microsoft-com:office:word" xmlns:w="http://schemas.openxmlformats.org/wordprocessingml/2006/main" xmlns:w14="http://schemas.microsoft.com/office/word/2010/wordml" xmlns:w15="http://schemas.microsoft.com/office/word/2012/wordml" xmlns:w16cex="http://schemas.microsoft.com/office/word/2018/wordml/cex" xmlns:w16cid="http://schemas.microsoft.com/office/word/2016/wordml/cid" xmlns:w16="http://schemas.microsoft.com/office/word/2018/wordml" xmlns:w16sdtdh="http://schemas.microsoft.com/office/word/2020/wordml/sdtdatahash" xmlns:w16se="http://schemas.microsoft.com/office/word/2015/wordml/symex" xmlns:wpg="http://schemas.microsoft.com/office/word/2010/wordprocessingGroup" xmlns:wpi="http://schemas.microsoft.com/office/word/2010/wordprocessingInk" xmlns:wne="http://schemas.microsoft.com/office/word/2006/wordml" xmlns:wps="http://schemas.microsoft.com/office/word/2010/wordprocessingShape" mc:Ignorable="w14 w15 w16se w16cid w16 w16cex w16sdtdh wp14">
   <w:body>
     <w:p>
       <w:pPr>
@@ -18,7 +18,7 @@
         <w:t xml:space="preserve"> </w:t>
       </w:r>
       <w:r>
-        <w:t>Oh</w:t>
+        <w:t>O</w:t>
       </w:r>
       <w:r>
         <w:rPr>
@@ -66,6 +66,7 @@
           <w:sz w:val="23"/>
         </w:rPr>
       </w:pPr>
+      <w:proofErr w:type="gramStart"/>
       <w:r>
         <w:rPr>
           <w:b/>
@@ -81,6 +82,7 @@
         </w:rPr>
         <w:t>(</w:t>
       </w:r>
+      <w:proofErr w:type="gramEnd"/>
       <w:r>
         <w:rPr>
           <w:b/>
@@ -266,16 +268,8 @@
         <w:rPr>
           <w:sz w:val="23"/>
         </w:rPr>
-        <w:t xml:space="preserve">accessing any element in an array or </w:t>
-      </w:r>
-      <w:proofErr w:type="spellStart"/>
-      <w:r>
-        <w:rPr>
-          <w:sz w:val="23"/>
-        </w:rPr>
-        <w:t>ArrayList</w:t>
-      </w:r>
-      <w:proofErr w:type="spellEnd"/>
+        <w:t>accessing any element in an array or ArrayList</w:t>
+      </w:r>
     </w:p>
     <w:bookmarkEnd w:id="1"/>
     <w:p>
@@ -316,22 +310,22 @@
         <w:rPr>
           <w:sz w:val="23"/>
         </w:rPr>
-        <w:t xml:space="preserve">, Peek, and </w:t>
-      </w:r>
-      <w:proofErr w:type="spellStart"/>
-      <w:r>
-        <w:rPr>
-          <w:sz w:val="23"/>
-        </w:rPr>
-        <w:t>isEmpty</w:t>
-      </w:r>
-      <w:proofErr w:type="spellEnd"/>
-      <w:r>
-        <w:rPr>
-          <w:sz w:val="23"/>
-        </w:rPr>
-        <w:t xml:space="preserve"> operations for a stack (containing n elements);</w:t>
-      </w:r>
+        <w:t>, Peek, and isEmpty</w:t>
+      </w:r>
+      <w:r>
+        <w:rPr>
+          <w:sz w:val="23"/>
+        </w:rPr>
+        <w:t xml:space="preserve"> operations for a stack (containing n elements</w:t>
+      </w:r>
+      <w:proofErr w:type="gramStart"/>
+      <w:r>
+        <w:rPr>
+          <w:sz w:val="23"/>
+        </w:rPr>
+        <w:t>);</w:t>
+      </w:r>
+      <w:proofErr w:type="gramEnd"/>
     </w:p>
     <w:p>
       <w:pPr>
@@ -431,7 +425,6 @@
         </w:rPr>
         <w:t xml:space="preserve"> </w:t>
       </w:r>
-      <w:proofErr w:type="spellStart"/>
       <w:r>
         <w:rPr>
           <w:rFonts w:ascii="Courier New" w:hAnsi="Courier New"/>
@@ -440,7 +433,6 @@
         </w:rPr>
         <w:t>isEmpty</w:t>
       </w:r>
-      <w:proofErr w:type="spellEnd"/>
       <w:r>
         <w:rPr>
           <w:rFonts w:ascii="Courier New" w:hAnsi="Courier New"/>
@@ -469,7 +461,6 @@
         </w:rPr>
         <w:t xml:space="preserve">in </w:t>
       </w:r>
-      <w:proofErr w:type="spellStart"/>
       <w:r>
         <w:rPr>
           <w:rFonts w:ascii="Courier New" w:hAnsi="Courier New"/>
@@ -477,7 +468,6 @@
         </w:rPr>
         <w:t>PriorityQueue</w:t>
       </w:r>
-      <w:proofErr w:type="spellEnd"/>
     </w:p>
     <w:p>
       <w:pPr>
@@ -1011,7 +1001,6 @@
         </w:rPr>
         <w:t xml:space="preserve"> </w:t>
       </w:r>
-      <w:proofErr w:type="spellStart"/>
       <w:r>
         <w:rPr>
           <w:rFonts w:ascii="Courier New" w:hAnsi="Courier New"/>
@@ -1019,7 +1008,6 @@
         </w:rPr>
         <w:t>ArrayList</w:t>
       </w:r>
-      <w:proofErr w:type="spellEnd"/>
     </w:p>
     <w:p>
       <w:pPr>
@@ -1039,7 +1027,6 @@
       </w:pPr>
       <w:bookmarkStart w:id="3" w:name="_Hlk82116405"/>
       <w:bookmarkEnd w:id="2"/>
-      <w:proofErr w:type="spellStart"/>
       <w:r>
         <w:rPr>
           <w:rFonts w:ascii="Courier New" w:hAnsi="Courier New"/>
@@ -1048,7 +1035,6 @@
         </w:rPr>
         <w:t>addFirst</w:t>
       </w:r>
-      <w:proofErr w:type="spellEnd"/>
       <w:r>
         <w:rPr>
           <w:spacing w:val="-1"/>
@@ -1062,7 +1048,6 @@
         </w:rPr>
         <w:t xml:space="preserve"> </w:t>
       </w:r>
-      <w:proofErr w:type="spellStart"/>
       <w:r>
         <w:rPr>
           <w:rFonts w:ascii="Courier New" w:hAnsi="Courier New"/>
@@ -1071,7 +1056,6 @@
         </w:rPr>
         <w:t>addLast</w:t>
       </w:r>
-      <w:proofErr w:type="spellEnd"/>
       <w:r>
         <w:rPr>
           <w:spacing w:val="-1"/>
@@ -1086,7 +1070,6 @@
         </w:rPr>
         <w:t xml:space="preserve"> </w:t>
       </w:r>
-      <w:proofErr w:type="spellStart"/>
       <w:r>
         <w:rPr>
           <w:rFonts w:ascii="Courier New" w:hAnsi="Courier New"/>
@@ -1095,7 +1078,6 @@
         </w:rPr>
         <w:t>getFirst</w:t>
       </w:r>
-      <w:proofErr w:type="spellEnd"/>
       <w:r>
         <w:rPr>
           <w:spacing w:val="-1"/>
@@ -1109,7 +1091,6 @@
         </w:rPr>
         <w:t xml:space="preserve"> </w:t>
       </w:r>
-      <w:proofErr w:type="spellStart"/>
       <w:r>
         <w:rPr>
           <w:rFonts w:ascii="Courier New" w:hAnsi="Courier New"/>
@@ -1118,7 +1099,6 @@
         </w:rPr>
         <w:t>getLast</w:t>
       </w:r>
-      <w:proofErr w:type="spellEnd"/>
       <w:r>
         <w:rPr>
           <w:spacing w:val="-1"/>
@@ -1133,7 +1113,6 @@
         </w:rPr>
         <w:t xml:space="preserve"> </w:t>
       </w:r>
-      <w:proofErr w:type="spellStart"/>
       <w:r>
         <w:rPr>
           <w:rFonts w:ascii="Courier New" w:hAnsi="Courier New"/>
@@ -1142,7 +1121,6 @@
         </w:rPr>
         <w:t>removeFirst</w:t>
       </w:r>
-      <w:proofErr w:type="spellEnd"/>
       <w:r>
         <w:rPr>
           <w:spacing w:val="-1"/>
@@ -1156,7 +1134,6 @@
         </w:rPr>
         <w:t xml:space="preserve"> </w:t>
       </w:r>
-      <w:proofErr w:type="spellStart"/>
       <w:r>
         <w:rPr>
           <w:rFonts w:ascii="Courier New" w:hAnsi="Courier New"/>
@@ -1165,7 +1142,6 @@
         </w:rPr>
         <w:t>removeLast</w:t>
       </w:r>
-      <w:proofErr w:type="spellEnd"/>
       <w:r>
         <w:rPr>
           <w:rFonts w:ascii="Courier New" w:hAnsi="Courier New"/>
@@ -1248,7 +1224,6 @@
         </w:rPr>
         <w:t xml:space="preserve"> </w:t>
       </w:r>
-      <w:proofErr w:type="spellStart"/>
       <w:r>
         <w:rPr>
           <w:rFonts w:ascii="Courier New" w:hAnsi="Courier New"/>
@@ -1257,7 +1232,6 @@
         </w:rPr>
         <w:t>containsKey</w:t>
       </w:r>
-      <w:proofErr w:type="spellEnd"/>
       <w:r>
         <w:rPr>
           <w:spacing w:val="-1"/>
@@ -1428,6 +1402,7 @@
         <w:pStyle w:val="Heading1"/>
         <w:spacing w:before="225" w:line="264" w:lineRule="exact"/>
       </w:pPr>
+      <w:proofErr w:type="gramStart"/>
       <w:r>
         <w:rPr>
           <w:i/>
@@ -1435,7 +1410,11 @@
         <w:t>O</w:t>
       </w:r>
       <w:r>
-        <w:t>(log</w:t>
+        <w:t>(</w:t>
+      </w:r>
+      <w:proofErr w:type="gramEnd"/>
+      <w:r>
+        <w:t>log</w:t>
       </w:r>
       <w:r>
         <w:rPr>
@@ -1934,7 +1913,6 @@
         </w:rPr>
         <w:t xml:space="preserve"> </w:t>
       </w:r>
-      <w:proofErr w:type="spellStart"/>
       <w:r>
         <w:rPr>
           <w:rFonts w:ascii="Courier New" w:hAnsi="Courier New"/>
@@ -1943,7 +1921,6 @@
         </w:rPr>
         <w:t>PriorityQueue</w:t>
       </w:r>
-      <w:proofErr w:type="spellEnd"/>
       <w:r>
         <w:rPr>
           <w:rFonts w:ascii="Courier New" w:hAnsi="Courier New"/>
@@ -2001,14 +1978,12 @@
           <w:sz w:val="20"/>
         </w:rPr>
       </w:pPr>
-      <w:proofErr w:type="spellStart"/>
       <w:r>
         <w:rPr>
           <w:spacing w:val="-1"/>
         </w:rPr>
         <w:t>containsKey</w:t>
       </w:r>
-      <w:proofErr w:type="spellEnd"/>
       <w:r>
         <w:rPr>
           <w:rFonts w:ascii="Times New Roman" w:hAnsi="Times New Roman"/>
@@ -2083,11 +2058,9 @@
         </w:rPr>
         <w:t xml:space="preserve"> </w:t>
       </w:r>
-      <w:proofErr w:type="spellStart"/>
       <w:r>
         <w:t>TreeMap</w:t>
       </w:r>
-      <w:proofErr w:type="spellEnd"/>
     </w:p>
     <w:p>
       <w:pPr>
@@ -2218,8 +2191,17 @@
           <w:spacing w:val="-1"/>
           <w:sz w:val="23"/>
         </w:rPr>
-        <w:t>(e.g.</w:t>
-      </w:r>
+        <w:t>(</w:t>
+      </w:r>
+      <w:proofErr w:type="gramStart"/>
+      <w:r>
+        <w:rPr>
+          <w:spacing w:val="-1"/>
+          <w:sz w:val="23"/>
+        </w:rPr>
+        <w:t>e.g.</w:t>
+      </w:r>
+      <w:proofErr w:type="gramEnd"/>
       <w:r>
         <w:rPr>
           <w:spacing w:val="1"/>
@@ -2348,7 +2330,6 @@
         </w:rPr>
         <w:t xml:space="preserve"> </w:t>
       </w:r>
-      <w:proofErr w:type="spellStart"/>
       <w:r>
         <w:rPr>
           <w:rFonts w:ascii="Courier New" w:hAnsi="Courier New"/>
@@ -2356,7 +2337,6 @@
         </w:rPr>
         <w:t>ArrayList</w:t>
       </w:r>
-      <w:proofErr w:type="spellEnd"/>
     </w:p>
     <w:p>
       <w:pPr>
@@ -2495,7 +2475,6 @@
         </w:rPr>
         <w:t xml:space="preserve"> </w:t>
       </w:r>
-      <w:proofErr w:type="spellStart"/>
       <w:r>
         <w:rPr>
           <w:rFonts w:ascii="Courier New" w:hAnsi="Courier New"/>
@@ -2503,7 +2482,6 @@
         </w:rPr>
         <w:t>ArrayList</w:t>
       </w:r>
-      <w:proofErr w:type="spellEnd"/>
       <w:r>
         <w:rPr>
           <w:sz w:val="23"/>
@@ -2837,6 +2815,7 @@
           <w:sz w:val="23"/>
         </w:rPr>
       </w:pPr>
+      <w:proofErr w:type="gramStart"/>
       <w:r>
         <w:rPr>
           <w:b/>
@@ -2852,6 +2831,7 @@
         </w:rPr>
         <w:t>(</w:t>
       </w:r>
+      <w:proofErr w:type="gramEnd"/>
       <w:r>
         <w:rPr>
           <w:b/>
@@ -2985,14 +2965,12 @@
           <w:sz w:val="23"/>
         </w:rPr>
       </w:pPr>
-      <w:proofErr w:type="spellStart"/>
       <w:r>
         <w:rPr>
           <w:sz w:val="23"/>
         </w:rPr>
         <w:t>Mergesort</w:t>
       </w:r>
-      <w:proofErr w:type="spellEnd"/>
     </w:p>
     <w:p>
       <w:pPr>
@@ -4428,12 +4406,14 @@
         </w:rPr>
         <w:t xml:space="preserve"> </w:t>
       </w:r>
+      <w:proofErr w:type="gramStart"/>
       <w:r>
         <w:rPr>
           <w:sz w:val="20"/>
         </w:rPr>
         <w:t>most</w:t>
       </w:r>
+      <w:proofErr w:type="gramEnd"/>
       <w:r>
         <w:rPr>
           <w:spacing w:val="-2"/>
@@ -4580,7 +4560,7 @@
         <mc:AlternateContent>
           <mc:Choice Requires="wpg">
             <w:drawing>
-              <wp:anchor distT="0" distB="0" distL="114300" distR="114300" simplePos="0" relativeHeight="251659264" behindDoc="1" locked="0" layoutInCell="1" allowOverlap="1" wp14:anchorId="4AC71C51" wp14:editId="2D4E6AF2">
+              <wp:anchor distT="0" distB="0" distL="114300" distR="114300" simplePos="0" relativeHeight="251655680" behindDoc="1" locked="0" layoutInCell="1" allowOverlap="1" wp14:anchorId="4AC71C51" wp14:editId="2D4E6AF2">
                 <wp:simplePos x="0" y="0"/>
                 <wp:positionH relativeFrom="page">
                   <wp:posOffset>546735</wp:posOffset>
@@ -4990,7 +4970,7 @@
           </mc:Choice>
           <mc:Fallback>
             <w:pict>
-              <v:group w14:anchorId="4AC71C51" id="Group 133" o:spid="_x0000_s1026" style="position:absolute;left:0;text-align:left;margin-left:43.05pt;margin-top:34.45pt;width:526.95pt;height:286.45pt;z-index:-251657216;mso-position-horizontal-relative:page" coordorigin="861,689" coordsize="10539,5729" o:gfxdata="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">
+              <v:group w14:anchorId="4AC71C51" id="Group 133" o:spid="_x0000_s1026" style="position:absolute;left:0;text-align:left;margin-left:43.05pt;margin-top:34.45pt;width:526.95pt;height:286.45pt;z-index:-251660800;mso-position-horizontal-relative:page" coordorigin="861,689" coordsize="10539,5729" o:gfxdata="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">
                 <v:shapetype id="_x0000_t75" coordsize="21600,21600" o:spt="75" o:preferrelative="t" path="m@4@5l@4@11@9@11@9@5xe" filled="f" stroked="f">
                   <v:stroke joinstyle="miter"/>
                   <v:formulas>
@@ -5606,12 +5586,21 @@
                 <w:sz w:val="15"/>
               </w:rPr>
             </w:pPr>
+            <w:proofErr w:type="gramStart"/>
             <w:r>
               <w:rPr>
                 <w:rFonts w:ascii="Consolas" w:eastAsia="Consolas" w:hAnsi="Consolas" w:cs="Consolas"/>
                 <w:sz w:val="15"/>
               </w:rPr>
-              <w:t>Θ(1)</w:t>
+              <w:t>Θ(</w:t>
+            </w:r>
+            <w:proofErr w:type="gramEnd"/>
+            <w:r>
+              <w:rPr>
+                <w:rFonts w:ascii="Consolas" w:eastAsia="Consolas" w:hAnsi="Consolas" w:cs="Consolas"/>
+                <w:sz w:val="15"/>
+              </w:rPr>
+              <w:t>1)</w:t>
             </w:r>
           </w:p>
         </w:tc>
@@ -5698,12 +5687,21 @@
                 <w:sz w:val="15"/>
               </w:rPr>
             </w:pPr>
+            <w:proofErr w:type="gramStart"/>
             <w:r>
               <w:rPr>
                 <w:rFonts w:ascii="Consolas" w:eastAsia="Consolas" w:hAnsi="Consolas" w:cs="Consolas"/>
                 <w:sz w:val="15"/>
               </w:rPr>
-              <w:t>O(1)</w:t>
+              <w:t>O(</w:t>
+            </w:r>
+            <w:proofErr w:type="gramEnd"/>
+            <w:r>
+              <w:rPr>
+                <w:rFonts w:ascii="Consolas" w:eastAsia="Consolas" w:hAnsi="Consolas" w:cs="Consolas"/>
+                <w:sz w:val="15"/>
+              </w:rPr>
+              <w:t>1)</w:t>
             </w:r>
           </w:p>
         </w:tc>
@@ -5889,12 +5887,21 @@
                 <w:sz w:val="15"/>
               </w:rPr>
             </w:pPr>
+            <w:proofErr w:type="gramStart"/>
             <w:r>
               <w:rPr>
                 <w:rFonts w:ascii="Consolas" w:eastAsia="Consolas" w:hAnsi="Consolas" w:cs="Consolas"/>
                 <w:sz w:val="15"/>
               </w:rPr>
-              <w:t>Θ(1)</w:t>
+              <w:t>Θ(</w:t>
+            </w:r>
+            <w:proofErr w:type="gramEnd"/>
+            <w:r>
+              <w:rPr>
+                <w:rFonts w:ascii="Consolas" w:eastAsia="Consolas" w:hAnsi="Consolas" w:cs="Consolas"/>
+                <w:sz w:val="15"/>
+              </w:rPr>
+              <w:t>1)</w:t>
             </w:r>
           </w:p>
         </w:tc>
@@ -5912,12 +5919,21 @@
                 <w:sz w:val="15"/>
               </w:rPr>
             </w:pPr>
+            <w:proofErr w:type="gramStart"/>
             <w:r>
               <w:rPr>
                 <w:rFonts w:ascii="Consolas" w:eastAsia="Consolas" w:hAnsi="Consolas" w:cs="Consolas"/>
                 <w:sz w:val="15"/>
               </w:rPr>
-              <w:t>Θ(1)</w:t>
+              <w:t>Θ(</w:t>
+            </w:r>
+            <w:proofErr w:type="gramEnd"/>
+            <w:r>
+              <w:rPr>
+                <w:rFonts w:ascii="Consolas" w:eastAsia="Consolas" w:hAnsi="Consolas" w:cs="Consolas"/>
+                <w:sz w:val="15"/>
+              </w:rPr>
+              <w:t>1)</w:t>
             </w:r>
           </w:p>
         </w:tc>
@@ -5980,12 +5996,21 @@
                 <w:sz w:val="15"/>
               </w:rPr>
             </w:pPr>
+            <w:proofErr w:type="gramStart"/>
             <w:r>
               <w:rPr>
                 <w:rFonts w:ascii="Consolas" w:eastAsia="Consolas" w:hAnsi="Consolas" w:cs="Consolas"/>
                 <w:sz w:val="15"/>
               </w:rPr>
-              <w:t>O(1)</w:t>
+              <w:t>O(</w:t>
+            </w:r>
+            <w:proofErr w:type="gramEnd"/>
+            <w:r>
+              <w:rPr>
+                <w:rFonts w:ascii="Consolas" w:eastAsia="Consolas" w:hAnsi="Consolas" w:cs="Consolas"/>
+                <w:sz w:val="15"/>
+              </w:rPr>
+              <w:t>1)</w:t>
             </w:r>
           </w:p>
         </w:tc>
@@ -6003,12 +6028,21 @@
                 <w:sz w:val="15"/>
               </w:rPr>
             </w:pPr>
+            <w:proofErr w:type="gramStart"/>
             <w:r>
               <w:rPr>
                 <w:rFonts w:ascii="Consolas" w:eastAsia="Consolas" w:hAnsi="Consolas" w:cs="Consolas"/>
                 <w:sz w:val="15"/>
               </w:rPr>
-              <w:t>O(1)</w:t>
+              <w:t>O(</w:t>
+            </w:r>
+            <w:proofErr w:type="gramEnd"/>
+            <w:r>
+              <w:rPr>
+                <w:rFonts w:ascii="Consolas" w:eastAsia="Consolas" w:hAnsi="Consolas" w:cs="Consolas"/>
+                <w:sz w:val="15"/>
+              </w:rPr>
+              <w:t>1)</w:t>
             </w:r>
           </w:p>
         </w:tc>
@@ -6126,12 +6160,21 @@
                 <w:sz w:val="15"/>
               </w:rPr>
             </w:pPr>
+            <w:proofErr w:type="gramStart"/>
             <w:r>
               <w:rPr>
                 <w:rFonts w:ascii="Consolas" w:eastAsia="Consolas" w:hAnsi="Consolas" w:cs="Consolas"/>
                 <w:sz w:val="15"/>
               </w:rPr>
-              <w:t>Θ(1)</w:t>
+              <w:t>Θ(</w:t>
+            </w:r>
+            <w:proofErr w:type="gramEnd"/>
+            <w:r>
+              <w:rPr>
+                <w:rFonts w:ascii="Consolas" w:eastAsia="Consolas" w:hAnsi="Consolas" w:cs="Consolas"/>
+                <w:sz w:val="15"/>
+              </w:rPr>
+              <w:t>1)</w:t>
             </w:r>
           </w:p>
         </w:tc>
@@ -6149,12 +6192,21 @@
                 <w:sz w:val="15"/>
               </w:rPr>
             </w:pPr>
+            <w:proofErr w:type="gramStart"/>
             <w:r>
               <w:rPr>
                 <w:rFonts w:ascii="Consolas" w:eastAsia="Consolas" w:hAnsi="Consolas" w:cs="Consolas"/>
                 <w:sz w:val="15"/>
               </w:rPr>
-              <w:t>Θ(1)</w:t>
+              <w:t>Θ(</w:t>
+            </w:r>
+            <w:proofErr w:type="gramEnd"/>
+            <w:r>
+              <w:rPr>
+                <w:rFonts w:ascii="Consolas" w:eastAsia="Consolas" w:hAnsi="Consolas" w:cs="Consolas"/>
+                <w:sz w:val="15"/>
+              </w:rPr>
+              <w:t>1)</w:t>
             </w:r>
           </w:p>
         </w:tc>
@@ -6217,12 +6269,21 @@
                 <w:sz w:val="15"/>
               </w:rPr>
             </w:pPr>
+            <w:proofErr w:type="gramStart"/>
             <w:r>
               <w:rPr>
                 <w:rFonts w:ascii="Consolas" w:eastAsia="Consolas" w:hAnsi="Consolas" w:cs="Consolas"/>
                 <w:sz w:val="15"/>
               </w:rPr>
-              <w:t>O(1)</w:t>
+              <w:t>O(</w:t>
+            </w:r>
+            <w:proofErr w:type="gramEnd"/>
+            <w:r>
+              <w:rPr>
+                <w:rFonts w:ascii="Consolas" w:eastAsia="Consolas" w:hAnsi="Consolas" w:cs="Consolas"/>
+                <w:sz w:val="15"/>
+              </w:rPr>
+              <w:t>1)</w:t>
             </w:r>
           </w:p>
         </w:tc>
@@ -6240,12 +6301,21 @@
                 <w:sz w:val="15"/>
               </w:rPr>
             </w:pPr>
+            <w:proofErr w:type="gramStart"/>
             <w:r>
               <w:rPr>
                 <w:rFonts w:ascii="Consolas" w:eastAsia="Consolas" w:hAnsi="Consolas" w:cs="Consolas"/>
                 <w:sz w:val="15"/>
               </w:rPr>
-              <w:t>O(1)</w:t>
+              <w:t>O(</w:t>
+            </w:r>
+            <w:proofErr w:type="gramEnd"/>
+            <w:r>
+              <w:rPr>
+                <w:rFonts w:ascii="Consolas" w:eastAsia="Consolas" w:hAnsi="Consolas" w:cs="Consolas"/>
+                <w:sz w:val="15"/>
+              </w:rPr>
+              <w:t>1)</w:t>
             </w:r>
           </w:p>
         </w:tc>
@@ -6291,6 +6361,7 @@
               </w:rPr>
             </w:pPr>
             <w:hyperlink r:id="rId10" w:anchor="Singly_linked_lists">
+              <w:proofErr w:type="gramStart"/>
               <w:r>
                 <w:rPr>
                   <w:rFonts w:ascii="Arial" w:eastAsia="Consolas" w:hAnsi="Consolas" w:cs="Consolas"/>
@@ -6317,6 +6388,7 @@
                 </w:rPr>
                 <w:t>ly-Linked</w:t>
               </w:r>
+              <w:proofErr w:type="gramEnd"/>
               <w:r>
                 <w:rPr>
                   <w:rFonts w:ascii="Arial" w:eastAsia="Consolas" w:hAnsi="Consolas" w:cs="Consolas"/>
@@ -6399,12 +6471,21 @@
                 <w:sz w:val="15"/>
               </w:rPr>
             </w:pPr>
+            <w:proofErr w:type="gramStart"/>
             <w:r>
               <w:rPr>
                 <w:rFonts w:ascii="Consolas" w:eastAsia="Consolas" w:hAnsi="Consolas" w:cs="Consolas"/>
                 <w:sz w:val="15"/>
               </w:rPr>
-              <w:t>Θ(1)</w:t>
+              <w:t>Θ(</w:t>
+            </w:r>
+            <w:proofErr w:type="gramEnd"/>
+            <w:r>
+              <w:rPr>
+                <w:rFonts w:ascii="Consolas" w:eastAsia="Consolas" w:hAnsi="Consolas" w:cs="Consolas"/>
+                <w:sz w:val="15"/>
+              </w:rPr>
+              <w:t>1)</w:t>
             </w:r>
           </w:p>
         </w:tc>
@@ -6422,12 +6503,21 @@
                 <w:sz w:val="15"/>
               </w:rPr>
             </w:pPr>
+            <w:proofErr w:type="gramStart"/>
             <w:r>
               <w:rPr>
                 <w:rFonts w:ascii="Consolas" w:eastAsia="Consolas" w:hAnsi="Consolas" w:cs="Consolas"/>
                 <w:sz w:val="15"/>
               </w:rPr>
-              <w:t>Θ(1)</w:t>
+              <w:t>Θ(</w:t>
+            </w:r>
+            <w:proofErr w:type="gramEnd"/>
+            <w:r>
+              <w:rPr>
+                <w:rFonts w:ascii="Consolas" w:eastAsia="Consolas" w:hAnsi="Consolas" w:cs="Consolas"/>
+                <w:sz w:val="15"/>
+              </w:rPr>
+              <w:t>1)</w:t>
             </w:r>
           </w:p>
         </w:tc>
@@ -6490,12 +6580,21 @@
                 <w:sz w:val="15"/>
               </w:rPr>
             </w:pPr>
+            <w:proofErr w:type="gramStart"/>
             <w:r>
               <w:rPr>
                 <w:rFonts w:ascii="Consolas" w:eastAsia="Consolas" w:hAnsi="Consolas" w:cs="Consolas"/>
                 <w:sz w:val="15"/>
               </w:rPr>
-              <w:t>O(1)</w:t>
+              <w:t>O(</w:t>
+            </w:r>
+            <w:proofErr w:type="gramEnd"/>
+            <w:r>
+              <w:rPr>
+                <w:rFonts w:ascii="Consolas" w:eastAsia="Consolas" w:hAnsi="Consolas" w:cs="Consolas"/>
+                <w:sz w:val="15"/>
+              </w:rPr>
+              <w:t>1)</w:t>
             </w:r>
           </w:p>
         </w:tc>
@@ -6513,12 +6612,21 @@
                 <w:sz w:val="15"/>
               </w:rPr>
             </w:pPr>
+            <w:proofErr w:type="gramStart"/>
             <w:r>
               <w:rPr>
                 <w:rFonts w:ascii="Consolas" w:eastAsia="Consolas" w:hAnsi="Consolas" w:cs="Consolas"/>
                 <w:sz w:val="15"/>
               </w:rPr>
-              <w:t>O(1)</w:t>
+              <w:t>O(</w:t>
+            </w:r>
+            <w:proofErr w:type="gramEnd"/>
+            <w:r>
+              <w:rPr>
+                <w:rFonts w:ascii="Consolas" w:eastAsia="Consolas" w:hAnsi="Consolas" w:cs="Consolas"/>
+                <w:sz w:val="15"/>
+              </w:rPr>
+              <w:t>1)</w:t>
             </w:r>
           </w:p>
         </w:tc>
@@ -6564,6 +6672,7 @@
               </w:rPr>
             </w:pPr>
             <w:hyperlink r:id="rId11">
+              <w:proofErr w:type="gramStart"/>
               <w:r>
                 <w:rPr>
                   <w:rFonts w:ascii="Arial" w:eastAsia="Consolas" w:hAnsi="Consolas" w:cs="Consolas"/>
@@ -6590,6 +6699,7 @@
                 </w:rPr>
                 <w:t>-Linked</w:t>
               </w:r>
+              <w:proofErr w:type="gramEnd"/>
               <w:r>
                 <w:rPr>
                   <w:rFonts w:ascii="Arial" w:eastAsia="Consolas" w:hAnsi="Consolas" w:cs="Consolas"/>
@@ -6672,12 +6782,21 @@
                 <w:sz w:val="15"/>
               </w:rPr>
             </w:pPr>
+            <w:proofErr w:type="gramStart"/>
             <w:r>
               <w:rPr>
                 <w:rFonts w:ascii="Consolas" w:eastAsia="Consolas" w:hAnsi="Consolas" w:cs="Consolas"/>
                 <w:sz w:val="15"/>
               </w:rPr>
-              <w:t>Θ(1)</w:t>
+              <w:t>Θ(</w:t>
+            </w:r>
+            <w:proofErr w:type="gramEnd"/>
+            <w:r>
+              <w:rPr>
+                <w:rFonts w:ascii="Consolas" w:eastAsia="Consolas" w:hAnsi="Consolas" w:cs="Consolas"/>
+                <w:sz w:val="15"/>
+              </w:rPr>
+              <w:t>1)</w:t>
             </w:r>
           </w:p>
         </w:tc>
@@ -6695,12 +6814,21 @@
                 <w:sz w:val="15"/>
               </w:rPr>
             </w:pPr>
+            <w:proofErr w:type="gramStart"/>
             <w:r>
               <w:rPr>
                 <w:rFonts w:ascii="Consolas" w:eastAsia="Consolas" w:hAnsi="Consolas" w:cs="Consolas"/>
                 <w:sz w:val="15"/>
               </w:rPr>
-              <w:t>Θ(1)</w:t>
+              <w:t>Θ(</w:t>
+            </w:r>
+            <w:proofErr w:type="gramEnd"/>
+            <w:r>
+              <w:rPr>
+                <w:rFonts w:ascii="Consolas" w:eastAsia="Consolas" w:hAnsi="Consolas" w:cs="Consolas"/>
+                <w:sz w:val="15"/>
+              </w:rPr>
+              <w:t>1)</w:t>
             </w:r>
           </w:p>
         </w:tc>
@@ -6763,12 +6891,21 @@
                 <w:sz w:val="15"/>
               </w:rPr>
             </w:pPr>
+            <w:proofErr w:type="gramStart"/>
             <w:r>
               <w:rPr>
                 <w:rFonts w:ascii="Consolas" w:eastAsia="Consolas" w:hAnsi="Consolas" w:cs="Consolas"/>
                 <w:sz w:val="15"/>
               </w:rPr>
-              <w:t>O(1)</w:t>
+              <w:t>O(</w:t>
+            </w:r>
+            <w:proofErr w:type="gramEnd"/>
+            <w:r>
+              <w:rPr>
+                <w:rFonts w:ascii="Consolas" w:eastAsia="Consolas" w:hAnsi="Consolas" w:cs="Consolas"/>
+                <w:sz w:val="15"/>
+              </w:rPr>
+              <w:t>1)</w:t>
             </w:r>
           </w:p>
         </w:tc>
@@ -6786,12 +6923,21 @@
                 <w:sz w:val="15"/>
               </w:rPr>
             </w:pPr>
+            <w:proofErr w:type="gramStart"/>
             <w:r>
               <w:rPr>
                 <w:rFonts w:ascii="Consolas" w:eastAsia="Consolas" w:hAnsi="Consolas" w:cs="Consolas"/>
                 <w:sz w:val="15"/>
               </w:rPr>
-              <w:t>O(1)</w:t>
+              <w:t>O(</w:t>
+            </w:r>
+            <w:proofErr w:type="gramEnd"/>
+            <w:r>
+              <w:rPr>
+                <w:rFonts w:ascii="Consolas" w:eastAsia="Consolas" w:hAnsi="Consolas" w:cs="Consolas"/>
+                <w:sz w:val="15"/>
+              </w:rPr>
+              <w:t>1)</w:t>
             </w:r>
           </w:p>
         </w:tc>
@@ -7065,12 +7211,21 @@
                 <w:sz w:val="15"/>
               </w:rPr>
             </w:pPr>
+            <w:proofErr w:type="gramStart"/>
             <w:r>
               <w:rPr>
                 <w:rFonts w:ascii="Consolas" w:eastAsia="Consolas" w:hAnsi="Consolas" w:cs="Consolas"/>
                 <w:sz w:val="15"/>
               </w:rPr>
-              <w:t>O(n</w:t>
+              <w:t>O(</w:t>
+            </w:r>
+            <w:proofErr w:type="gramEnd"/>
+            <w:r>
+              <w:rPr>
+                <w:rFonts w:ascii="Consolas" w:eastAsia="Consolas" w:hAnsi="Consolas" w:cs="Consolas"/>
+                <w:sz w:val="15"/>
+              </w:rPr>
+              <w:t>n</w:t>
             </w:r>
             <w:r>
               <w:rPr>
@@ -7176,12 +7331,21 @@
                 <w:sz w:val="15"/>
               </w:rPr>
             </w:pPr>
+            <w:proofErr w:type="gramStart"/>
             <w:r>
               <w:rPr>
                 <w:rFonts w:ascii="Consolas" w:eastAsia="Consolas" w:hAnsi="Consolas" w:cs="Consolas"/>
                 <w:sz w:val="15"/>
               </w:rPr>
-              <w:t>Θ(1)</w:t>
+              <w:t>Θ(</w:t>
+            </w:r>
+            <w:proofErr w:type="gramEnd"/>
+            <w:r>
+              <w:rPr>
+                <w:rFonts w:ascii="Consolas" w:eastAsia="Consolas" w:hAnsi="Consolas" w:cs="Consolas"/>
+                <w:sz w:val="15"/>
+              </w:rPr>
+              <w:t>1)</w:t>
             </w:r>
           </w:p>
         </w:tc>
@@ -7199,12 +7363,21 @@
                 <w:sz w:val="15"/>
               </w:rPr>
             </w:pPr>
+            <w:proofErr w:type="gramStart"/>
             <w:r>
               <w:rPr>
                 <w:rFonts w:ascii="Consolas" w:eastAsia="Consolas" w:hAnsi="Consolas" w:cs="Consolas"/>
                 <w:sz w:val="15"/>
               </w:rPr>
-              <w:t>Θ(1)</w:t>
+              <w:t>Θ(</w:t>
+            </w:r>
+            <w:proofErr w:type="gramEnd"/>
+            <w:r>
+              <w:rPr>
+                <w:rFonts w:ascii="Consolas" w:eastAsia="Consolas" w:hAnsi="Consolas" w:cs="Consolas"/>
+                <w:sz w:val="15"/>
+              </w:rPr>
+              <w:t>1)</w:t>
             </w:r>
           </w:p>
         </w:tc>
@@ -7222,12 +7395,21 @@
                 <w:sz w:val="15"/>
               </w:rPr>
             </w:pPr>
+            <w:proofErr w:type="gramStart"/>
             <w:r>
               <w:rPr>
                 <w:rFonts w:ascii="Consolas" w:eastAsia="Consolas" w:hAnsi="Consolas" w:cs="Consolas"/>
                 <w:sz w:val="15"/>
               </w:rPr>
-              <w:t>Θ(1)</w:t>
+              <w:t>Θ(</w:t>
+            </w:r>
+            <w:proofErr w:type="gramEnd"/>
+            <w:r>
+              <w:rPr>
+                <w:rFonts w:ascii="Consolas" w:eastAsia="Consolas" w:hAnsi="Consolas" w:cs="Consolas"/>
+                <w:sz w:val="15"/>
+              </w:rPr>
+              <w:t>1)</w:t>
             </w:r>
           </w:p>
         </w:tc>
@@ -7440,7 +7622,7 @@
               <mc:AlternateContent>
                 <mc:Choice Requires="wps">
                   <w:drawing>
-                    <wp:anchor distT="0" distB="0" distL="114300" distR="114300" simplePos="0" relativeHeight="251661312" behindDoc="1" locked="0" layoutInCell="1" allowOverlap="1" wp14:anchorId="53963780" wp14:editId="1A390F03">
+                    <wp:anchor distT="0" distB="0" distL="114300" distR="114300" simplePos="0" relativeHeight="251656704" behindDoc="1" locked="0" layoutInCell="1" allowOverlap="1" wp14:anchorId="53963780" wp14:editId="1A390F03">
                       <wp:simplePos x="0" y="0"/>
                       <wp:positionH relativeFrom="page">
                         <wp:posOffset>596265</wp:posOffset>
@@ -8080,7 +8262,7 @@
                 </mc:Choice>
                 <mc:Fallback>
                   <w:pict>
-                    <v:shape w14:anchorId="31031377" id="Freeform: Shape 132" o:spid="_x0000_s1026" style="position:absolute;margin-left:46.95pt;margin-top:2.05pt;width:134.65pt;height:12.8pt;z-index:-251655168;visibility:visible;mso-wrap-style:square;mso-width-percent:0;mso-height-percent:0;mso-wrap-distance-left:9pt;mso-wrap-distance-top:0;mso-wrap-distance-right:9pt;mso-wrap-distance-bottom:0;mso-position-horizontal:absolute;mso-position-horizontal-relative:page;mso-position-vertical:absolute;mso-position-vertical-relative:page;mso-width-percent:0;mso-height-percent:0;mso-width-relative:page;mso-height-relative:page;v-text-anchor:top" coordsize="2693,256" o:gfxdata="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" path="m,236l,19,,14,2,9,6,6,10,2,14,r5,l836,r5,l846,2r3,4l853,9r2,5l855,19r,217l855,241r-2,5l849,249r-3,4l841,255r-5,l19,255r-5,l10,253,6,249,2,246,,241r,-5xm919,236r,-217l919,14r2,-5l924,6r4,-4l933,r5,l1754,r6,l1764,2r4,4l1772,9r2,5l1774,19r,217l1774,241r-2,5l1768,249r-4,4l1760,255r-6,l938,255r-5,l928,253r-4,-4l921,246r-2,-5l919,236xm1837,236r,-217l1837,14r2,-5l1843,6r4,-4l1851,r6,l2673,r5,l2683,2r4,4l2690,9r2,5l2692,19r,217l2692,241r-2,5l2687,249r-4,4l2678,255r-5,l1857,255r-6,l1847,253r-4,-4l1839,246r-2,-5l1837,236xe" filled="f" strokecolor="#286500" strokeweight=".22506mm">
+                    <v:shape w14:anchorId="3E1D9248" id="Freeform: Shape 132" o:spid="_x0000_s1026" style="position:absolute;margin-left:46.95pt;margin-top:2.05pt;width:134.65pt;height:12.8pt;z-index:-251659776;visibility:visible;mso-wrap-style:square;mso-width-percent:0;mso-height-percent:0;mso-wrap-distance-left:9pt;mso-wrap-distance-top:0;mso-wrap-distance-right:9pt;mso-wrap-distance-bottom:0;mso-position-horizontal:absolute;mso-position-horizontal-relative:page;mso-position-vertical:absolute;mso-position-vertical-relative:page;mso-width-percent:0;mso-height-percent:0;mso-width-relative:page;mso-height-relative:page;v-text-anchor:top" coordsize="2693,256" o:gfxdata="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" path="m,236l,19,,14,2,9,6,6,10,2,14,r5,l836,r5,l846,2r3,4l853,9r2,5l855,19r,217l855,241r-2,5l849,249r-3,4l841,255r-5,l19,255r-5,l10,253,6,249,2,246,,241r,-5xm919,236r,-217l919,14r2,-5l924,6r4,-4l933,r5,l1754,r6,l1764,2r4,4l1772,9r2,5l1774,19r,217l1774,241r-2,5l1768,249r-4,4l1760,255r-6,l938,255r-5,l928,253r-4,-4l921,246r-2,-5l919,236xm1837,236r,-217l1837,14r2,-5l1843,6r4,-4l1851,r6,l2673,r5,l2683,2r4,4l2690,9r2,5l2692,19r,217l2692,241r-2,5l2687,249r-4,4l2678,255r-5,l1857,255r-6,l1847,253r-4,-4l1839,246r-2,-5l1837,236xe" filled="f" strokecolor="#286500" strokeweight=".22506mm">
                       <v:path arrowok="t" o:connecttype="custom" o:connectlocs="0,3252470;1270,3246120;6350,3241675;12065,3240405;534035,3240405;539115,3244215;542925,3249295;542925,3390265;541655,3396615;537210,3401060;530860,3402330;8890,3402330;3810,3398520;0,3393440;583565,3390265;583565,3249295;586740,3244215;592455,3240405;1113790,3240405;1120140,3241675;1125220,3246120;1126490,3252470;1126490,3393440;1122680,3398520;1117600,3402330;595630,3402330;589280,3401060;584835,3396615;583565,3390265;1166495,3252470;1167765,3246120;1172845,3241675;1179195,3240405;1700530,3240405;1706245,3244215;1709420,3249295;1709420,3390265;1708150,3396615;1703705,3401060;1697355,3402330;1175385,3402330;1170305,3398520;1166495,3393440" o:connectangles="0,0,0,0,0,0,0,0,0,0,0,0,0,0,0,0,0,0,0,0,0,0,0,0,0,0,0,0,0,0,0,0,0,0,0,0,0,0,0,0,0,0,0"/>
                       <w10:wrap anchorx="page" anchory="page"/>
                     </v:shape>
@@ -8372,7 +8554,7 @@
                 </mc:Choice>
                 <mc:Fallback>
                   <w:pict>
-                    <v:group w14:anchorId="2C079BBA" id="Group 130" o:spid="_x0000_s1026" style="width:59.95pt;height:.65pt;mso-position-horizontal-relative:char;mso-position-vertical-relative:line" coordsize="1199,13" o:gfxdata="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">
+                    <v:group w14:anchorId="5AEB84F0" id="Group 130" o:spid="_x0000_s1026" style="width:59.95pt;height:.65pt;mso-position-horizontal-relative:char;mso-position-vertical-relative:line" coordsize="1199,13" o:gfxdata="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">
                       <v:rect id="docshape9" o:spid="_x0000_s1027" style="position:absolute;width:1199;height:13;visibility:visible;mso-wrap-style:square;v-text-anchor:top" o:gfxdata="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" fillcolor="#444" stroked="f"/>
                       <w10:anchorlock/>
                     </v:group>
@@ -9921,7 +10103,7 @@
         <mc:AlternateContent>
           <mc:Choice Requires="wps">
             <w:drawing>
-              <wp:anchor distT="0" distB="0" distL="114300" distR="114300" simplePos="0" relativeHeight="251661312" behindDoc="1" locked="0" layoutInCell="1" allowOverlap="1" wp14:anchorId="4930BE7D" wp14:editId="6BDD1A84">
+              <wp:anchor distT="0" distB="0" distL="114300" distR="114300" simplePos="0" relativeHeight="251657728" behindDoc="1" locked="0" layoutInCell="1" allowOverlap="1" wp14:anchorId="4930BE7D" wp14:editId="6BDD1A84">
                 <wp:simplePos x="0" y="0"/>
                 <wp:positionH relativeFrom="page">
                   <wp:posOffset>1709420</wp:posOffset>
@@ -11634,7 +11816,7 @@
           </mc:Choice>
           <mc:Fallback>
             <w:pict>
-              <v:shape w14:anchorId="63A254FC" id="Freeform: Shape 129" o:spid="_x0000_s1026" style="position:absolute;margin-left:134.6pt;margin-top:-86.1pt;width:364.3pt;height:28.75pt;z-index:-251655168;visibility:visible;mso-wrap-style:square;mso-width-percent:0;mso-height-percent:0;mso-wrap-distance-left:9pt;mso-wrap-distance-top:0;mso-wrap-distance-right:9pt;mso-wrap-distance-bottom:0;mso-position-horizontal:absolute;mso-position-horizontal-relative:page;mso-position-vertical:absolute;mso-position-vertical-relative:text;mso-width-percent:0;mso-height-percent:0;mso-width-relative:page;mso-height-relative:page;v-text-anchor:top" coordsize="7286,575" o:gfxdata="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" path="m,236l,19,,14,1,9,5,5,9,2,13,r6,l835,r6,l845,2r4,3l853,9r1,5l854,19r,217l854,241r-1,5l849,249r-4,4l841,255r-6,l19,255r-6,l9,253,5,249,1,246,,241r,-5xm918,236r,-217l918,14r2,-5l924,5r4,-3l932,r5,l1754,r5,l1764,2r3,3l1771,9r2,5l1773,19r,217l1773,241r-2,5l1767,249r-3,4l1759,255r-5,l937,255r-5,l928,253r-4,-4l920,246r-2,-5l918,236xm1837,236r,-217l1837,14r2,-5l1842,5r4,-3l1851,r5,l2672,r6,l2682,2r4,3l2690,9r2,5l2692,19r,217l2692,241r-2,5l2686,249r-4,4l2678,255r-6,l1856,255r-5,l1846,253r-4,-4l1839,246r-2,-5l1837,236xm2755,236r,-217l2755,14r2,-5l2761,5r4,-3l2769,r6,l3591,r5,l3601,2r4,3l3608,9r2,5l3610,19r,217l3610,241r-2,5l3605,249r-4,4l3596,255r-5,l2775,255r-6,l2765,253r-4,-4l2757,246r-2,-5l2755,236xm3674,236r,-217l3674,14r2,-5l3680,5r3,-3l3688,r5,l4510,r5,l4520,2r3,3l4527,9r2,5l4529,19r,217l4529,241r-2,5l4523,249r-3,4l4515,255r-5,l3693,255r-5,l3683,253r-3,-4l3676,246r-2,-5l3674,236xm4593,236r,-217l4593,14r2,-5l4598,5r4,-3l4607,r5,l5428,r6,l5438,2r4,3l5446,9r1,5l5447,19r,217l5447,241r-1,5l5442,249r-4,4l5434,255r-6,l4612,255r-5,l4602,253r-4,-4l4595,246r-2,-5l4593,236xm5511,236r,-217l5511,14r2,-5l5517,5r4,-3l5525,r5,l6347,r5,l6357,2r3,3l6364,9r2,5l6366,19r,217l6366,241r-2,5l6360,249r-3,4l6352,255r-5,l5530,255r-5,l5521,253r-4,-4l5513,246r-2,-5l5511,236xm6430,236r,-217l6430,14r2,-5l6436,5r3,-3l6444,r5,l7266,r5,l7275,2r4,3l7283,9r2,5l7285,19r,217l7285,241r-2,5l7279,249r-4,4l7271,255r-5,l6449,255r-5,l6439,253r-3,-4l6432,246r-2,-5l6430,236xm918,555r,-217l918,333r2,-5l924,324r4,-3l932,319r5,l1754,319r5,l1764,321r3,3l1771,328r2,5l1773,338r,217l1773,560r-2,5l1767,568r-3,4l1759,574r-5,l937,574r-5,l928,572r-4,-4l920,565r-2,-5l918,555xm1837,555r,-217l1837,333r2,-5l1842,324r4,-3l1851,319r5,l2672,319r6,l2682,321r4,3l2690,328r2,5l2692,338r,217l2692,560r-2,5l2686,568r-4,4l2678,574r-6,l1856,574r-5,l1846,572r-4,-4l1839,565r-2,-5l1837,555xm2755,555r,-217l2755,333r2,-5l2761,324r4,-3l2769,319r6,l3591,319r5,l3601,321r4,3l3608,328r2,5l3610,338r,217l3610,560r-2,5l3605,568r-4,4l3596,574r-5,l2775,574r-6,l2765,572r-4,-4l2757,565r-2,-5l2755,555xm4593,555r,-217l4593,333r2,-5l4598,324r4,-3l4607,319r5,l5428,319r6,l5438,321r4,3l5446,328r1,5l5447,338r,217l5447,560r-1,5l5442,568r-4,4l5434,574r-6,l4612,574r-5,l4602,572r-4,-4l4595,565r-2,-5l4593,555xm5511,555r,-217l5511,333r2,-5l5517,324r4,-3l5525,319r5,l6347,319r5,l6357,321r3,3l6364,328r2,5l6366,338r,217l6366,560r-2,5l6360,568r-3,4l6352,574r-5,l5530,574r-5,l5521,572r-4,-4l5513,565r-2,-5l5511,555xm6430,555r,-217l6430,333r2,-5l6436,324r3,-3l6444,319r5,l7266,319r5,l7275,321r4,3l7283,328r2,5l7285,338r,217l7285,560r-2,5l7279,568r-4,4l7271,574r-5,l6449,574r-5,l6439,572r-3,-4l6432,565r-2,-5l6430,555xe" filled="f" strokecolor="#286500" strokeweight=".22506mm">
+              <v:shape w14:anchorId="79AA161E" id="Freeform: Shape 129" o:spid="_x0000_s1026" style="position:absolute;margin-left:134.6pt;margin-top:-86.1pt;width:364.3pt;height:28.75pt;z-index:-251658752;visibility:visible;mso-wrap-style:square;mso-width-percent:0;mso-height-percent:0;mso-wrap-distance-left:9pt;mso-wrap-distance-top:0;mso-wrap-distance-right:9pt;mso-wrap-distance-bottom:0;mso-position-horizontal:absolute;mso-position-horizontal-relative:page;mso-position-vertical:absolute;mso-position-vertical-relative:text;mso-width-percent:0;mso-height-percent:0;mso-width-relative:page;mso-height-relative:page;v-text-anchor:top" coordsize="7286,575" o:gfxdata="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" path="m,236l,19,,14,1,9,5,5,9,2,13,r6,l835,r6,l845,2r4,3l853,9r1,5l854,19r,217l854,241r-1,5l849,249r-4,4l841,255r-6,l19,255r-6,l9,253,5,249,1,246,,241r,-5xm918,236r,-217l918,14r2,-5l924,5r4,-3l932,r5,l1754,r5,l1764,2r3,3l1771,9r2,5l1773,19r,217l1773,241r-2,5l1767,249r-3,4l1759,255r-5,l937,255r-5,l928,253r-4,-4l920,246r-2,-5l918,236xm1837,236r,-217l1837,14r2,-5l1842,5r4,-3l1851,r5,l2672,r6,l2682,2r4,3l2690,9r2,5l2692,19r,217l2692,241r-2,5l2686,249r-4,4l2678,255r-6,l1856,255r-5,l1846,253r-4,-4l1839,246r-2,-5l1837,236xm2755,236r,-217l2755,14r2,-5l2761,5r4,-3l2769,r6,l3591,r5,l3601,2r4,3l3608,9r2,5l3610,19r,217l3610,241r-2,5l3605,249r-4,4l3596,255r-5,l2775,255r-6,l2765,253r-4,-4l2757,246r-2,-5l2755,236xm3674,236r,-217l3674,14r2,-5l3680,5r3,-3l3688,r5,l4510,r5,l4520,2r3,3l4527,9r2,5l4529,19r,217l4529,241r-2,5l4523,249r-3,4l4515,255r-5,l3693,255r-5,l3683,253r-3,-4l3676,246r-2,-5l3674,236xm4593,236r,-217l4593,14r2,-5l4598,5r4,-3l4607,r5,l5428,r6,l5438,2r4,3l5446,9r1,5l5447,19r,217l5447,241r-1,5l5442,249r-4,4l5434,255r-6,l4612,255r-5,l4602,253r-4,-4l4595,246r-2,-5l4593,236xm5511,236r,-217l5511,14r2,-5l5517,5r4,-3l5525,r5,l6347,r5,l6357,2r3,3l6364,9r2,5l6366,19r,217l6366,241r-2,5l6360,249r-3,4l6352,255r-5,l5530,255r-5,l5521,253r-4,-4l5513,246r-2,-5l5511,236xm6430,236r,-217l6430,14r2,-5l6436,5r3,-3l6444,r5,l7266,r5,l7275,2r4,3l7283,9r2,5l7285,19r,217l7285,241r-2,5l7279,249r-4,4l7271,255r-5,l6449,255r-5,l6439,253r-3,-4l6432,246r-2,-5l6430,236xm918,555r,-217l918,333r2,-5l924,324r4,-3l932,319r5,l1754,319r5,l1764,321r3,3l1771,328r2,5l1773,338r,217l1773,560r-2,5l1767,568r-3,4l1759,574r-5,l937,574r-5,l928,572r-4,-4l920,565r-2,-5l918,555xm1837,555r,-217l1837,333r2,-5l1842,324r4,-3l1851,319r5,l2672,319r6,l2682,321r4,3l2690,328r2,5l2692,338r,217l2692,560r-2,5l2686,568r-4,4l2678,574r-6,l1856,574r-5,l1846,572r-4,-4l1839,565r-2,-5l1837,555xm2755,555r,-217l2755,333r2,-5l2761,324r4,-3l2769,319r6,l3591,319r5,l3601,321r4,3l3608,328r2,5l3610,338r,217l3610,560r-2,5l3605,568r-4,4l3596,574r-5,l2775,574r-6,l2765,572r-4,-4l2757,565r-2,-5l2755,555xm4593,555r,-217l4593,333r2,-5l4598,324r4,-3l4607,319r5,l5428,319r6,l5438,321r4,3l5446,328r1,5l5447,338r,217l5447,560r-1,5l5442,568r-4,4l5434,574r-6,l4612,574r-5,l4602,572r-4,-4l4595,565r-2,-5l4593,555xm5511,555r,-217l5511,333r2,-5l5517,324r4,-3l5525,319r5,l6347,319r5,l6357,321r3,3l6364,328r2,5l6366,338r,217l6366,560r-2,5l6360,568r-3,4l6352,574r-5,l5530,574r-5,l5521,572r-4,-4l5513,565r-2,-5l5511,555xm6430,555r,-217l6430,333r2,-5l6436,324r3,-3l6444,319r5,l7266,319r5,l7275,321r4,3l7283,328r2,5l7285,338r,217l7285,560r-2,5l7279,568r-4,4l7271,574r-5,l6449,574r-5,l6439,572r-3,-4l6432,565r-2,-5l6430,555xe" filled="f" strokecolor="#286500" strokeweight=".22506mm">
                 <v:path arrowok="t" o:connecttype="custom" o:connectlocs="8255,-1093470;542290,-1084580;534035,-931545;0,-940435;589280,-1092200;1124585,-1087755;1120140,-932815;584200,-937260;1169670,-1090295;1705610,-1090295;1705610,-935355;1169670,-935355;1750695,-1087755;2286635,-1092200;2291080,-937260;1755775,-932815;2332990,-1084580;2867025,-1093470;2875915,-940435;2341880,-931545;2916555,-1081405;3446780,-1093470;3458845,-943610;2928620,-931545;3499485,-943610;3511550,-1093470;4042410,-1081405;4030345,-931545;3499485,-943610;4091940,-1093470;4625975,-1084580;4617085,-931545;4083050,-940435;589280,-889635;1124585,-885190;1120140,-730250;584200,-734695;1169670,-887730;1705610,-887730;1705610,-732790;1169670,-732790;1750695,-885190;2286635,-889635;2291080,-734695;1755775,-730250;2916555,-882015;3450590,-890905;3458845,-737870;2925445,-728980;3499485,-878840;4030345,-890905;4042410,-741045;3511550,-728980;4083050,-741045;4095115,-890905;4625975,-878840;4613910,-728980;4083050,-741045" o:connectangles="0,0,0,0,0,0,0,0,0,0,0,0,0,0,0,0,0,0,0,0,0,0,0,0,0,0,0,0,0,0,0,0,0,0,0,0,0,0,0,0,0,0,0,0,0,0,0,0,0,0,0,0,0,0,0,0,0,0"/>
                 <w10:wrap anchorx="page"/>
               </v:shape>
@@ -11650,7 +11832,7 @@
         <mc:AlternateContent>
           <mc:Choice Requires="wps">
             <w:drawing>
-              <wp:anchor distT="0" distB="0" distL="114300" distR="114300" simplePos="0" relativeHeight="251662336" behindDoc="1" locked="0" layoutInCell="1" allowOverlap="1" wp14:anchorId="6E08B074" wp14:editId="05EFC94A">
+              <wp:anchor distT="0" distB="0" distL="114300" distR="114300" simplePos="0" relativeHeight="251658752" behindDoc="1" locked="0" layoutInCell="1" allowOverlap="1" wp14:anchorId="6E08B074" wp14:editId="05EFC94A">
                 <wp:simplePos x="0" y="0"/>
                 <wp:positionH relativeFrom="page">
                   <wp:posOffset>1709420</wp:posOffset>
@@ -12835,7 +13017,7 @@
           </mc:Choice>
           <mc:Fallback>
             <w:pict>
-              <v:shape w14:anchorId="391FE1C1" id="Freeform: Shape 128" o:spid="_x0000_s1026" style="position:absolute;margin-left:134.6pt;margin-top:-38.25pt;width:180.55pt;height:28.75pt;z-index:-251654144;visibility:visible;mso-wrap-style:square;mso-width-percent:0;mso-height-percent:0;mso-wrap-distance-left:9pt;mso-wrap-distance-top:0;mso-wrap-distance-right:9pt;mso-wrap-distance-bottom:0;mso-position-horizontal:absolute;mso-position-horizontal-relative:page;mso-position-vertical:absolute;mso-position-vertical-relative:text;mso-width-percent:0;mso-height-percent:0;mso-width-relative:page;mso-height-relative:page;v-text-anchor:top" coordsize="3611,575" o:gfxdata="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" path="m,236l,19,,13,1,9,5,5,9,2,13,r6,l835,r6,l845,2r4,3l853,9r1,4l854,19r,217l854,241r-1,4l849,249r-4,4l841,255r-6,l19,255r-6,l9,253,5,249,1,245,,241r,-5xm918,236r,-217l918,13r2,-4l924,5r4,-3l932,r5,l1754,r5,l1764,2r3,3l1771,9r2,4l1773,19r,217l1773,241r-2,4l1767,249r-3,4l1759,255r-5,l937,255r-5,l928,253r-4,-4l920,245r-2,-4l918,236xm1837,236r,-217l1837,13r2,-4l1842,5r4,-3l1851,r5,l2672,r6,l2682,2r4,3l2690,9r2,4l2692,19r,217l2692,241r-2,4l2686,249r-4,4l2678,255r-6,l1856,255r-5,l1846,253r-4,-4l1839,245r-2,-4l1837,236xm2755,236r,-217l2755,13r2,-4l2761,5r4,-3l2769,r6,l3591,r5,l3601,2r4,3l3608,9r2,4l3610,19r,217l3610,241r-2,4l3605,249r-4,4l3596,255r-5,l2775,255r-6,l2765,253r-4,-4l2757,245r-2,-4l2755,236xm,555l,338r,-6l1,328r4,-4l9,320r4,-1l19,319r816,l841,319r4,1l849,324r4,4l854,332r,6l854,555r,5l853,564r-4,4l845,572r-4,2l835,574r-816,l13,574,9,572,5,568,1,564,,560r,-5xm918,555r,-217l918,332r2,-4l924,324r4,-4l932,319r5,l1754,319r5,l1764,320r3,4l1771,328r2,4l1773,338r,217l1773,560r-2,4l1767,568r-3,4l1759,574r-5,l937,574r-5,l928,572r-4,-4l920,564r-2,-4l918,555xm1837,555r,-217l1837,332r2,-4l1842,324r4,-4l1851,319r5,l2672,319r6,l2682,320r4,4l2690,328r2,4l2692,338r,217l2692,560r-2,4l2686,568r-4,4l2678,574r-6,l1856,574r-5,l1846,572r-4,-4l1839,564r-2,-4l1837,555xm2755,555r,-217l2755,332r2,-4l2761,324r4,-4l2769,319r6,l3591,319r5,l3601,320r4,4l3608,328r2,4l3610,338r,217l3610,560r-2,4l3605,568r-4,4l3596,574r-5,l2775,574r-6,l2765,572r-4,-4l2757,564r-2,-4l2755,555xe" filled="f" strokecolor="#286500" strokeweight=".22506mm">
+              <v:shape w14:anchorId="0E819261" id="Freeform: Shape 128" o:spid="_x0000_s1026" style="position:absolute;margin-left:134.6pt;margin-top:-38.25pt;width:180.55pt;height:28.75pt;z-index:-251657728;visibility:visible;mso-wrap-style:square;mso-width-percent:0;mso-height-percent:0;mso-wrap-distance-left:9pt;mso-wrap-distance-top:0;mso-wrap-distance-right:9pt;mso-wrap-distance-bottom:0;mso-position-horizontal:absolute;mso-position-horizontal-relative:page;mso-position-vertical:absolute;mso-position-vertical-relative:text;mso-width-percent:0;mso-height-percent:0;mso-width-relative:page;mso-height-relative:page;v-text-anchor:top" coordsize="3611,575" o:gfxdata="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" path="m,236l,19,,13,1,9,5,5,9,2,13,r6,l835,r6,l845,2r4,3l853,9r1,4l854,19r,217l854,241r-1,4l849,249r-4,4l841,255r-6,l19,255r-6,l9,253,5,249,1,245,,241r,-5xm918,236r,-217l918,13r2,-4l924,5r4,-3l932,r5,l1754,r5,l1764,2r3,3l1771,9r2,4l1773,19r,217l1773,241r-2,4l1767,249r-3,4l1759,255r-5,l937,255r-5,l928,253r-4,-4l920,245r-2,-4l918,236xm1837,236r,-217l1837,13r2,-4l1842,5r4,-3l1851,r5,l2672,r6,l2682,2r4,3l2690,9r2,4l2692,19r,217l2692,241r-2,4l2686,249r-4,4l2678,255r-6,l1856,255r-5,l1846,253r-4,-4l1839,245r-2,-4l1837,236xm2755,236r,-217l2755,13r2,-4l2761,5r4,-3l2769,r6,l3591,r5,l3601,2r4,3l3608,9r2,4l3610,19r,217l3610,241r-2,4l3605,249r-4,4l3596,255r-5,l2775,255r-6,l2765,253r-4,-4l2757,245r-2,-4l2755,236xm,555l,338r,-6l1,328r4,-4l9,320r4,-1l19,319r816,l841,319r4,1l849,324r4,4l854,332r,6l854,555r,5l853,564r-4,4l845,572r-4,2l835,574r-816,l13,574,9,572,5,568,1,564,,560r,-5xm918,555r,-217l918,332r2,-4l924,324r4,-4l932,319r5,l1754,319r5,l1764,320r3,4l1771,328r2,4l1773,338r,217l1773,560r-2,4l1767,568r-3,4l1759,574r-5,l937,574r-5,l928,572r-4,-4l920,564r-2,-4l918,555xm1837,555r,-217l1837,332r2,-4l1842,324r4,-4l1851,319r5,l2672,319r6,l2682,320r4,4l2690,328r2,4l2692,338r,217l2692,560r-2,4l2686,568r-4,4l2678,574r-6,l1856,574r-5,l1846,572r-4,-4l1839,564r-2,-4l1837,555xm2755,555r,-217l2755,332r2,-4l2761,324r4,-4l2769,319r6,l3591,319r5,l3601,320r4,4l3608,328r2,4l3610,338r,217l3610,560r-2,4l3605,568r-4,4l3596,574r-5,l2775,574r-6,l2765,572r-4,-4l2757,564r-2,-4l2755,555xe" filled="f" strokecolor="#286500" strokeweight=".22506mm">
                 <v:path arrowok="t" o:connecttype="custom" o:connectlocs="635,-480060;12065,-485775;539115,-482600;542290,-335915;536575,-325120;8255,-323850;0,-332740;582930,-477520;591820,-485775;1120140,-484505;1125855,-473710;1122045,-327660;594995,-323850;584200,-330200;1166495,-473710;1172210,-484505;1700530,-485775;1709420,-477520;1708150,-330200;1696720,-323850;1169670,-327660;1749425,-335915;1753235,-482600;2280285,-485775;2291080,-480060;2292350,-332740;2283460,-323850;1755775,-325120;1749425,-335915;635,-277495;12065,-283210;539115,-280035;542290,-133350;536575,-122555;8255,-121285;0,-130175;582930,-274955;591820,-283210;1120140,-282575;1125855,-271145;1122045,-125095;594995,-121285;584200,-127635;1166495,-271145;1172210,-282575;1700530,-283210;1709420,-274955;1708150,-127635;1696720,-121285;1169670,-125095;1749425,-133350;1753235,-280035;2280285,-283210;2291080,-277495;2292350,-130175;2283460,-121285;1755775,-122555;1749425,-133350" o:connectangles="0,0,0,0,0,0,0,0,0,0,0,0,0,0,0,0,0,0,0,0,0,0,0,0,0,0,0,0,0,0,0,0,0,0,0,0,0,0,0,0,0,0,0,0,0,0,0,0,0,0,0,0,0,0,0,0,0,0"/>
                 <w10:wrap anchorx="page"/>
               </v:shape>
@@ -12913,7 +13095,7 @@
         <mc:AlternateContent>
           <mc:Choice Requires="wpg">
             <w:drawing>
-              <wp:anchor distT="0" distB="0" distL="0" distR="0" simplePos="0" relativeHeight="251663360" behindDoc="1" locked="0" layoutInCell="1" allowOverlap="1" wp14:anchorId="5E663352" wp14:editId="66882946">
+              <wp:anchor distT="0" distB="0" distL="0" distR="0" simplePos="0" relativeHeight="251659776" behindDoc="1" locked="0" layoutInCell="1" allowOverlap="1" wp14:anchorId="5E663352" wp14:editId="66882946">
                 <wp:simplePos x="0" y="0"/>
                 <wp:positionH relativeFrom="page">
                   <wp:posOffset>1721485</wp:posOffset>
@@ -15440,7 +15622,6 @@
                                 <w:t xml:space="preserve"> </w:t>
                               </w:r>
                               <w:hyperlink r:id="rId23">
-                                <w:proofErr w:type="spellStart"/>
                                 <w:r>
                                   <w:rPr>
                                     <w:rFonts w:ascii="Arial"/>
@@ -15467,7 +15648,6 @@
                                   </w:rPr>
                                   <w:t>esort</w:t>
                                 </w:r>
-                                <w:proofErr w:type="spellEnd"/>
                               </w:hyperlink>
                               <w:r>
                                 <w:rPr>
@@ -15479,7 +15659,6 @@
                                 <w:t xml:space="preserve"> </w:t>
                               </w:r>
                               <w:hyperlink r:id="rId24">
-                                <w:proofErr w:type="spellStart"/>
                                 <w:r>
                                   <w:rPr>
                                     <w:rFonts w:ascii="Arial"/>
@@ -15489,7 +15668,6 @@
                                   </w:rPr>
                                   <w:t>Timsort</w:t>
                                 </w:r>
-                                <w:proofErr w:type="spellEnd"/>
                               </w:hyperlink>
                               <w:r>
                                 <w:rPr>
@@ -15841,7 +16019,6 @@
                                 </w:rPr>
                               </w:pPr>
                               <w:hyperlink r:id="rId34">
-                                <w:proofErr w:type="spellStart"/>
                                 <w:r>
                                   <w:rPr>
                                     <w:rFonts w:ascii="Arial"/>
@@ -15851,7 +16028,6 @@
                                   </w:rPr>
                                   <w:t>Cubesort</w:t>
                                 </w:r>
-                                <w:proofErr w:type="spellEnd"/>
                               </w:hyperlink>
                             </w:p>
                           </w:txbxContent>
@@ -15923,11 +16099,19 @@
                                   <w:sz w:val="15"/>
                                 </w:rPr>
                               </w:pPr>
+                              <w:proofErr w:type="gramStart"/>
                               <w:r>
                                 <w:rPr>
                                   <w:sz w:val="15"/>
                                 </w:rPr>
-                                <w:t>Ω(n</w:t>
+                                <w:t>Ω(</w:t>
+                              </w:r>
+                              <w:proofErr w:type="gramEnd"/>
+                              <w:r>
+                                <w:rPr>
+                                  <w:sz w:val="15"/>
+                                </w:rPr>
+                                <w:t>n</w:t>
                               </w:r>
                               <w:r>
                                 <w:rPr>
@@ -16026,11 +16210,19 @@
                                   <w:sz w:val="15"/>
                                 </w:rPr>
                               </w:pPr>
+                              <w:proofErr w:type="gramStart"/>
                               <w:r>
                                 <w:rPr>
                                   <w:sz w:val="15"/>
                                 </w:rPr>
-                                <w:t>Θ(n</w:t>
+                                <w:t>Θ(</w:t>
+                              </w:r>
+                              <w:proofErr w:type="gramEnd"/>
+                              <w:r>
+                                <w:rPr>
+                                  <w:sz w:val="15"/>
+                                </w:rPr>
+                                <w:t>n</w:t>
                               </w:r>
                               <w:r>
                                 <w:rPr>
@@ -16211,11 +16403,19 @@
                                   <w:sz w:val="15"/>
                                 </w:rPr>
                               </w:pPr>
+                              <w:proofErr w:type="gramStart"/>
                               <w:r>
                                 <w:rPr>
                                   <w:sz w:val="15"/>
                                 </w:rPr>
-                                <w:t>Ω(n</w:t>
+                                <w:t>Ω(</w:t>
+                              </w:r>
+                              <w:proofErr w:type="gramEnd"/>
+                              <w:r>
+                                <w:rPr>
+                                  <w:sz w:val="15"/>
+                                </w:rPr>
+                                <w:t>n</w:t>
                               </w:r>
                               <w:r>
                                 <w:rPr>
@@ -16283,11 +16483,19 @@
                                   <w:sz w:val="15"/>
                                 </w:rPr>
                               </w:pPr>
+                              <w:proofErr w:type="gramStart"/>
                               <w:r>
                                 <w:rPr>
                                   <w:sz w:val="15"/>
                                 </w:rPr>
-                                <w:t>Θ(n</w:t>
+                                <w:t>Θ(</w:t>
+                              </w:r>
+                              <w:proofErr w:type="gramEnd"/>
+                              <w:r>
+                                <w:rPr>
+                                  <w:sz w:val="15"/>
+                                </w:rPr>
+                                <w:t>n</w:t>
                               </w:r>
                               <w:r>
                                 <w:rPr>
@@ -16355,11 +16563,19 @@
                                   <w:sz w:val="15"/>
                                 </w:rPr>
                               </w:pPr>
+                              <w:proofErr w:type="gramStart"/>
                               <w:r>
                                 <w:rPr>
                                   <w:sz w:val="15"/>
                                 </w:rPr>
-                                <w:t>O(n</w:t>
+                                <w:t>O(</w:t>
+                              </w:r>
+                              <w:proofErr w:type="gramEnd"/>
+                              <w:r>
+                                <w:rPr>
+                                  <w:sz w:val="15"/>
+                                </w:rPr>
+                                <w:t>n</w:t>
                               </w:r>
                               <w:r>
                                 <w:rPr>
@@ -16545,11 +16761,19 @@
                                   <w:sz w:val="15"/>
                                 </w:rPr>
                               </w:pPr>
+                              <w:proofErr w:type="gramStart"/>
                               <w:r>
                                 <w:rPr>
                                   <w:sz w:val="15"/>
                                 </w:rPr>
-                                <w:t>Θ(n</w:t>
+                                <w:t>Θ(</w:t>
+                              </w:r>
+                              <w:proofErr w:type="gramEnd"/>
+                              <w:r>
+                                <w:rPr>
+                                  <w:sz w:val="15"/>
+                                </w:rPr>
+                                <w:t>n</w:t>
                               </w:r>
                               <w:r>
                                 <w:rPr>
@@ -16617,11 +16841,19 @@
                                   <w:sz w:val="15"/>
                                 </w:rPr>
                               </w:pPr>
+                              <w:proofErr w:type="gramStart"/>
                               <w:r>
                                 <w:rPr>
                                   <w:sz w:val="15"/>
                                 </w:rPr>
-                                <w:t>O(n</w:t>
+                                <w:t>O(</w:t>
+                              </w:r>
+                              <w:proofErr w:type="gramEnd"/>
+                              <w:r>
+                                <w:rPr>
+                                  <w:sz w:val="15"/>
+                                </w:rPr>
+                                <w:t>n</w:t>
                               </w:r>
                               <w:r>
                                 <w:rPr>
@@ -16748,11 +16980,19 @@
                                   <w:sz w:val="15"/>
                                 </w:rPr>
                               </w:pPr>
+                              <w:proofErr w:type="gramStart"/>
                               <w:r>
                                 <w:rPr>
                                   <w:sz w:val="15"/>
                                 </w:rPr>
-                                <w:t>Ω(n</w:t>
+                                <w:t>Ω(</w:t>
+                              </w:r>
+                              <w:proofErr w:type="gramEnd"/>
+                              <w:r>
+                                <w:rPr>
+                                  <w:sz w:val="15"/>
+                                </w:rPr>
+                                <w:t>n</w:t>
                               </w:r>
                               <w:r>
                                 <w:rPr>
@@ -16820,11 +17060,19 @@
                                   <w:sz w:val="15"/>
                                 </w:rPr>
                               </w:pPr>
+                              <w:proofErr w:type="gramStart"/>
                               <w:r>
                                 <w:rPr>
                                   <w:sz w:val="15"/>
                                 </w:rPr>
-                                <w:t>Θ(n</w:t>
+                                <w:t>Θ(</w:t>
+                              </w:r>
+                              <w:proofErr w:type="gramEnd"/>
+                              <w:r>
+                                <w:rPr>
+                                  <w:sz w:val="15"/>
+                                </w:rPr>
+                                <w:t>n</w:t>
                               </w:r>
                               <w:r>
                                 <w:rPr>
@@ -16892,11 +17140,19 @@
                                   <w:sz w:val="15"/>
                                 </w:rPr>
                               </w:pPr>
+                              <w:proofErr w:type="gramStart"/>
                               <w:r>
                                 <w:rPr>
                                   <w:sz w:val="15"/>
                                 </w:rPr>
-                                <w:t>O(n</w:t>
+                                <w:t>O(</w:t>
+                              </w:r>
+                              <w:proofErr w:type="gramEnd"/>
+                              <w:r>
+                                <w:rPr>
+                                  <w:sz w:val="15"/>
+                                </w:rPr>
+                                <w:t>n</w:t>
                               </w:r>
                               <w:r>
                                 <w:rPr>
@@ -16964,11 +17220,19 @@
                                   <w:sz w:val="15"/>
                                 </w:rPr>
                               </w:pPr>
+                              <w:proofErr w:type="gramStart"/>
                               <w:r>
                                 <w:rPr>
                                   <w:sz w:val="15"/>
                                 </w:rPr>
-                                <w:t>O(1)</w:t>
+                                <w:t>O(</w:t>
+                              </w:r>
+                              <w:proofErr w:type="gramEnd"/>
+                              <w:r>
+                                <w:rPr>
+                                  <w:sz w:val="15"/>
+                                </w:rPr>
+                                <w:t>1)</w:t>
                               </w:r>
                             </w:p>
                           </w:txbxContent>
@@ -17200,11 +17464,19 @@
                                   <w:sz w:val="15"/>
                                 </w:rPr>
                               </w:pPr>
+                              <w:proofErr w:type="gramStart"/>
                               <w:r>
                                 <w:rPr>
                                   <w:sz w:val="15"/>
                                 </w:rPr>
-                                <w:t>O(1)</w:t>
+                                <w:t>O(</w:t>
+                              </w:r>
+                              <w:proofErr w:type="gramEnd"/>
+                              <w:r>
+                                <w:rPr>
+                                  <w:sz w:val="15"/>
+                                </w:rPr>
+                                <w:t>1)</w:t>
                               </w:r>
                             </w:p>
                           </w:txbxContent>
@@ -17436,11 +17708,19 @@
                                   <w:sz w:val="15"/>
                                 </w:rPr>
                               </w:pPr>
+                              <w:proofErr w:type="gramStart"/>
                               <w:r>
                                 <w:rPr>
                                   <w:sz w:val="15"/>
                                 </w:rPr>
-                                <w:t>O(1)</w:t>
+                                <w:t>O(</w:t>
+                              </w:r>
+                              <w:proofErr w:type="gramEnd"/>
+                              <w:r>
+                                <w:rPr>
+                                  <w:sz w:val="15"/>
+                                </w:rPr>
+                                <w:t>1)</w:t>
                               </w:r>
                             </w:p>
                           </w:txbxContent>
@@ -17672,11 +17952,19 @@
                                   <w:sz w:val="15"/>
                                 </w:rPr>
                               </w:pPr>
+                              <w:proofErr w:type="gramStart"/>
                               <w:r>
                                 <w:rPr>
                                   <w:sz w:val="15"/>
                                 </w:rPr>
-                                <w:t>O(1)</w:t>
+                                <w:t>O(</w:t>
+                              </w:r>
+                              <w:proofErr w:type="gramEnd"/>
+                              <w:r>
+                                <w:rPr>
+                                  <w:sz w:val="15"/>
+                                </w:rPr>
+                                <w:t>1)</w:t>
                               </w:r>
                             </w:p>
                           </w:txbxContent>
@@ -17731,11 +18019,19 @@
                                   <w:sz w:val="15"/>
                                 </w:rPr>
                               </w:pPr>
+                              <w:proofErr w:type="gramStart"/>
                               <w:r>
                                 <w:rPr>
                                   <w:sz w:val="15"/>
                                 </w:rPr>
-                                <w:t>Ω(n</w:t>
+                                <w:t>Ω(</w:t>
+                              </w:r>
+                              <w:proofErr w:type="gramEnd"/>
+                              <w:r>
+                                <w:rPr>
+                                  <w:sz w:val="15"/>
+                                </w:rPr>
+                                <w:t>n</w:t>
                               </w:r>
                               <w:r>
                                 <w:rPr>
@@ -17803,11 +18099,19 @@
                                   <w:sz w:val="15"/>
                                 </w:rPr>
                               </w:pPr>
+                              <w:proofErr w:type="gramStart"/>
                               <w:r>
                                 <w:rPr>
                                   <w:sz w:val="15"/>
                                 </w:rPr>
-                                <w:t>Θ(n</w:t>
+                                <w:t>Θ(</w:t>
+                              </w:r>
+                              <w:proofErr w:type="gramEnd"/>
+                              <w:r>
+                                <w:rPr>
+                                  <w:sz w:val="15"/>
+                                </w:rPr>
+                                <w:t>n</w:t>
                               </w:r>
                               <w:r>
                                 <w:rPr>
@@ -17993,11 +18297,19 @@
                                   <w:sz w:val="15"/>
                                 </w:rPr>
                               </w:pPr>
+                              <w:proofErr w:type="gramStart"/>
                               <w:r>
                                 <w:rPr>
                                   <w:sz w:val="15"/>
                                 </w:rPr>
-                                <w:t>Ω(n</w:t>
+                                <w:t>Ω(</w:t>
+                              </w:r>
+                              <w:proofErr w:type="gramEnd"/>
+                              <w:r>
+                                <w:rPr>
+                                  <w:sz w:val="15"/>
+                                </w:rPr>
+                                <w:t>n</w:t>
                               </w:r>
                               <w:r>
                                 <w:rPr>
@@ -18069,7 +18381,21 @@
                                 <w:rPr>
                                   <w:sz w:val="15"/>
                                 </w:rPr>
-                                <w:t>Θ(n(log(n))^2)</w:t>
+                                <w:t>Θ(n(log(n</w:t>
+                              </w:r>
+                              <w:proofErr w:type="gramStart"/>
+                              <w:r>
+                                <w:rPr>
+                                  <w:sz w:val="15"/>
+                                </w:rPr>
+                                <w:t>))^</w:t>
+                              </w:r>
+                              <w:proofErr w:type="gramEnd"/>
+                              <w:r>
+                                <w:rPr>
+                                  <w:sz w:val="15"/>
+                                </w:rPr>
+                                <w:t>2)</w:t>
                               </w:r>
                             </w:p>
                           </w:txbxContent>
@@ -18128,7 +18454,21 @@
                                 <w:rPr>
                                   <w:sz w:val="15"/>
                                 </w:rPr>
-                                <w:t>O(n(log(n))^2)</w:t>
+                                <w:t>O(n(log(n</w:t>
+                              </w:r>
+                              <w:proofErr w:type="gramStart"/>
+                              <w:r>
+                                <w:rPr>
+                                  <w:sz w:val="15"/>
+                                </w:rPr>
+                                <w:t>))^</w:t>
+                              </w:r>
+                              <w:proofErr w:type="gramEnd"/>
+                              <w:r>
+                                <w:rPr>
+                                  <w:sz w:val="15"/>
+                                </w:rPr>
+                                <w:t>2)</w:t>
                               </w:r>
                             </w:p>
                           </w:txbxContent>
@@ -18183,11 +18523,19 @@
                                   <w:sz w:val="15"/>
                                 </w:rPr>
                               </w:pPr>
+                              <w:proofErr w:type="gramStart"/>
                               <w:r>
                                 <w:rPr>
                                   <w:sz w:val="15"/>
                                 </w:rPr>
-                                <w:t>O(1)</w:t>
+                                <w:t>O(</w:t>
+                              </w:r>
+                              <w:proofErr w:type="gramEnd"/>
+                              <w:r>
+                                <w:rPr>
+                                  <w:sz w:val="15"/>
+                                </w:rPr>
+                                <w:t>1)</w:t>
                               </w:r>
                             </w:p>
                           </w:txbxContent>
@@ -18246,21 +18594,7 @@
                                 <w:rPr>
                                   <w:sz w:val="15"/>
                                 </w:rPr>
-                                <w:t>Ω(</w:t>
-                              </w:r>
-                              <w:proofErr w:type="spellStart"/>
-                              <w:r>
-                                <w:rPr>
-                                  <w:sz w:val="15"/>
-                                </w:rPr>
-                                <w:t>n+k</w:t>
-                              </w:r>
-                              <w:proofErr w:type="spellEnd"/>
-                              <w:r>
-                                <w:rPr>
-                                  <w:sz w:val="15"/>
-                                </w:rPr>
-                                <w:t>)</w:t>
+                                <w:t>Ω(n+k)</w:t>
                               </w:r>
                             </w:p>
                           </w:txbxContent>
@@ -18319,21 +18653,7 @@
                                 <w:rPr>
                                   <w:sz w:val="15"/>
                                 </w:rPr>
-                                <w:t>Θ(</w:t>
-                              </w:r>
-                              <w:proofErr w:type="spellStart"/>
-                              <w:r>
-                                <w:rPr>
-                                  <w:sz w:val="15"/>
-                                </w:rPr>
-                                <w:t>n+k</w:t>
-                              </w:r>
-                              <w:proofErr w:type="spellEnd"/>
-                              <w:r>
-                                <w:rPr>
-                                  <w:sz w:val="15"/>
-                                </w:rPr>
-                                <w:t>)</w:t>
+                                <w:t>Θ(n+k)</w:t>
                               </w:r>
                             </w:p>
                           </w:txbxContent>
@@ -18510,21 +18830,7 @@
                                 <w:rPr>
                                   <w:sz w:val="15"/>
                                 </w:rPr>
-                                <w:t>Ω(</w:t>
-                              </w:r>
-                              <w:proofErr w:type="spellStart"/>
-                              <w:r>
-                                <w:rPr>
-                                  <w:sz w:val="15"/>
-                                </w:rPr>
-                                <w:t>nk</w:t>
-                              </w:r>
-                              <w:proofErr w:type="spellEnd"/>
-                              <w:r>
-                                <w:rPr>
-                                  <w:sz w:val="15"/>
-                                </w:rPr>
-                                <w:t>)</w:t>
+                                <w:t>Ω(nk)</w:t>
                               </w:r>
                             </w:p>
                           </w:txbxContent>
@@ -18583,21 +18889,7 @@
                                 <w:rPr>
                                   <w:sz w:val="15"/>
                                 </w:rPr>
-                                <w:t>Θ(</w:t>
-                              </w:r>
-                              <w:proofErr w:type="spellStart"/>
-                              <w:r>
-                                <w:rPr>
-                                  <w:sz w:val="15"/>
-                                </w:rPr>
-                                <w:t>nk</w:t>
-                              </w:r>
-                              <w:proofErr w:type="spellEnd"/>
-                              <w:r>
-                                <w:rPr>
-                                  <w:sz w:val="15"/>
-                                </w:rPr>
-                                <w:t>)</w:t>
+                                <w:t>Θ(nk)</w:t>
                               </w:r>
                             </w:p>
                           </w:txbxContent>
@@ -18656,21 +18948,7 @@
                                 <w:rPr>
                                   <w:sz w:val="15"/>
                                 </w:rPr>
-                                <w:t>O(</w:t>
-                              </w:r>
-                              <w:proofErr w:type="spellStart"/>
-                              <w:r>
-                                <w:rPr>
-                                  <w:sz w:val="15"/>
-                                </w:rPr>
-                                <w:t>nk</w:t>
-                              </w:r>
-                              <w:proofErr w:type="spellEnd"/>
-                              <w:r>
-                                <w:rPr>
-                                  <w:sz w:val="15"/>
-                                </w:rPr>
-                                <w:t>)</w:t>
+                                <w:t>O(nk)</w:t>
                               </w:r>
                             </w:p>
                           </w:txbxContent>
@@ -18729,21 +19007,7 @@
                                 <w:rPr>
                                   <w:sz w:val="15"/>
                                 </w:rPr>
-                                <w:t>O(</w:t>
-                              </w:r>
-                              <w:proofErr w:type="spellStart"/>
-                              <w:r>
-                                <w:rPr>
-                                  <w:sz w:val="15"/>
-                                </w:rPr>
-                                <w:t>n+k</w:t>
-                              </w:r>
-                              <w:proofErr w:type="spellEnd"/>
-                              <w:r>
-                                <w:rPr>
-                                  <w:sz w:val="15"/>
-                                </w:rPr>
-                                <w:t>)</w:t>
+                                <w:t>O(n+k)</w:t>
                               </w:r>
                             </w:p>
                           </w:txbxContent>
@@ -18802,21 +19066,7 @@
                                 <w:rPr>
                                   <w:sz w:val="15"/>
                                 </w:rPr>
-                                <w:t>Ω(</w:t>
-                              </w:r>
-                              <w:proofErr w:type="spellStart"/>
-                              <w:r>
-                                <w:rPr>
-                                  <w:sz w:val="15"/>
-                                </w:rPr>
-                                <w:t>n+k</w:t>
-                              </w:r>
-                              <w:proofErr w:type="spellEnd"/>
-                              <w:r>
-                                <w:rPr>
-                                  <w:sz w:val="15"/>
-                                </w:rPr>
-                                <w:t>)</w:t>
+                                <w:t>Ω(n+k)</w:t>
                               </w:r>
                             </w:p>
                           </w:txbxContent>
@@ -18875,21 +19125,7 @@
                                 <w:rPr>
                                   <w:sz w:val="15"/>
                                 </w:rPr>
-                                <w:t>Θ(</w:t>
-                              </w:r>
-                              <w:proofErr w:type="spellStart"/>
-                              <w:r>
-                                <w:rPr>
-                                  <w:sz w:val="15"/>
-                                </w:rPr>
-                                <w:t>n+k</w:t>
-                              </w:r>
-                              <w:proofErr w:type="spellEnd"/>
-                              <w:r>
-                                <w:rPr>
-                                  <w:sz w:val="15"/>
-                                </w:rPr>
-                                <w:t>)</w:t>
+                                <w:t>Θ(n+k)</w:t>
                               </w:r>
                             </w:p>
                           </w:txbxContent>
@@ -18948,21 +19184,7 @@
                                 <w:rPr>
                                   <w:sz w:val="15"/>
                                 </w:rPr>
-                                <w:t>O(</w:t>
-                              </w:r>
-                              <w:proofErr w:type="spellStart"/>
-                              <w:r>
-                                <w:rPr>
-                                  <w:sz w:val="15"/>
-                                </w:rPr>
-                                <w:t>n+k</w:t>
-                              </w:r>
-                              <w:proofErr w:type="spellEnd"/>
-                              <w:r>
-                                <w:rPr>
-                                  <w:sz w:val="15"/>
-                                </w:rPr>
-                                <w:t>)</w:t>
+                                <w:t>O(n+k)</w:t>
                               </w:r>
                             </w:p>
                           </w:txbxContent>
@@ -19135,11 +19357,19 @@
                                   <w:sz w:val="15"/>
                                 </w:rPr>
                               </w:pPr>
+                              <w:proofErr w:type="gramStart"/>
                               <w:r>
                                 <w:rPr>
                                   <w:sz w:val="15"/>
                                 </w:rPr>
-                                <w:t>Θ(n</w:t>
+                                <w:t>Θ(</w:t>
+                              </w:r>
+                              <w:proofErr w:type="gramEnd"/>
+                              <w:r>
+                                <w:rPr>
+                                  <w:sz w:val="15"/>
+                                </w:rPr>
+                                <w:t>n</w:t>
                               </w:r>
                               <w:r>
                                 <w:rPr>
@@ -19207,11 +19437,19 @@
                                   <w:sz w:val="15"/>
                                 </w:rPr>
                               </w:pPr>
+                              <w:proofErr w:type="gramStart"/>
                               <w:r>
                                 <w:rPr>
                                   <w:sz w:val="15"/>
                                 </w:rPr>
-                                <w:t>O(n</w:t>
+                                <w:t>O(</w:t>
+                              </w:r>
+                              <w:proofErr w:type="gramEnd"/>
+                              <w:r>
+                                <w:rPr>
+                                  <w:sz w:val="15"/>
+                                </w:rPr>
+                                <w:t>n</w:t>
                               </w:r>
                               <w:r>
                                 <w:rPr>
@@ -19306,7 +19544,7 @@
           </mc:Choice>
           <mc:Fallback>
             <w:pict>
-              <v:group w14:anchorId="5E663352" id="Group 70" o:spid="_x0000_s1032" style="position:absolute;margin-left:135.55pt;margin-top:13.45pt;width:341.95pt;height:241.15pt;z-index:-251653120;mso-wrap-distance-left:0;mso-wrap-distance-right:0;mso-position-horizontal-relative:page" coordorigin="2711,269" coordsize="6839,4823" o:gfxdata="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">
+              <v:group w14:anchorId="5E663352" id="Group 70" o:spid="_x0000_s1032" style="position:absolute;margin-left:135.55pt;margin-top:13.45pt;width:341.95pt;height:241.15pt;z-index:-251656704;mso-wrap-distance-left:0;mso-wrap-distance-right:0;mso-position-horizontal-relative:page" coordorigin="2711,269" coordsize="6839,4823" o:gfxdata="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">
                 <v:shape id="docshape13" o:spid="_x0000_s1033" type="#_x0000_t75" style="position:absolute;left:2710;top:268;width:6839;height:4823;visibility:visible;mso-wrap-style:square" o:gfxdata="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">
                   <v:imagedata r:id="rId35" o:title=""/>
                 </v:shape>
@@ -19408,7 +19646,6 @@
                           <w:t xml:space="preserve"> </w:t>
                         </w:r>
                         <w:hyperlink r:id="rId37">
-                          <w:proofErr w:type="spellStart"/>
                           <w:r>
                             <w:rPr>
                               <w:rFonts w:ascii="Arial"/>
@@ -19435,7 +19672,6 @@
                             </w:rPr>
                             <w:t>esort</w:t>
                           </w:r>
-                          <w:proofErr w:type="spellEnd"/>
                         </w:hyperlink>
                         <w:r>
                           <w:rPr>
@@ -19447,7 +19683,6 @@
                           <w:t xml:space="preserve"> </w:t>
                         </w:r>
                         <w:hyperlink r:id="rId38">
-                          <w:proofErr w:type="spellStart"/>
                           <w:r>
                             <w:rPr>
                               <w:rFonts w:ascii="Arial"/>
@@ -19457,7 +19692,6 @@
                             </w:rPr>
                             <w:t>Timsort</w:t>
                           </w:r>
-                          <w:proofErr w:type="spellEnd"/>
                         </w:hyperlink>
                         <w:r>
                           <w:rPr>
@@ -19809,7 +20043,6 @@
                           </w:rPr>
                         </w:pPr>
                         <w:hyperlink r:id="rId48">
-                          <w:proofErr w:type="spellStart"/>
                           <w:r>
                             <w:rPr>
                               <w:rFonts w:ascii="Arial"/>
@@ -19819,7 +20052,6 @@
                             </w:rPr>
                             <w:t>Cubesort</w:t>
                           </w:r>
-                          <w:proofErr w:type="spellEnd"/>
                         </w:hyperlink>
                       </w:p>
                     </w:txbxContent>
@@ -19852,11 +20084,19 @@
                             <w:sz w:val="15"/>
                           </w:rPr>
                         </w:pPr>
+                        <w:proofErr w:type="gramStart"/>
                         <w:r>
                           <w:rPr>
                             <w:sz w:val="15"/>
                           </w:rPr>
-                          <w:t>Ω(n</w:t>
+                          <w:t>Ω(</w:t>
+                        </w:r>
+                        <w:proofErr w:type="gramEnd"/>
+                        <w:r>
+                          <w:rPr>
+                            <w:sz w:val="15"/>
+                          </w:rPr>
+                          <w:t>n</w:t>
                         </w:r>
                         <w:r>
                           <w:rPr>
@@ -19916,11 +20156,19 @@
                             <w:sz w:val="15"/>
                           </w:rPr>
                         </w:pPr>
+                        <w:proofErr w:type="gramStart"/>
                         <w:r>
                           <w:rPr>
                             <w:sz w:val="15"/>
                           </w:rPr>
-                          <w:t>Θ(n</w:t>
+                          <w:t>Θ(</w:t>
+                        </w:r>
+                        <w:proofErr w:type="gramEnd"/>
+                        <w:r>
+                          <w:rPr>
+                            <w:sz w:val="15"/>
+                          </w:rPr>
+                          <w:t>n</w:t>
                         </w:r>
                         <w:r>
                           <w:rPr>
@@ -20023,11 +20271,19 @@
                             <w:sz w:val="15"/>
                           </w:rPr>
                         </w:pPr>
+                        <w:proofErr w:type="gramStart"/>
                         <w:r>
                           <w:rPr>
                             <w:sz w:val="15"/>
                           </w:rPr>
-                          <w:t>Ω(n</w:t>
+                          <w:t>Ω(</w:t>
+                        </w:r>
+                        <w:proofErr w:type="gramEnd"/>
+                        <w:r>
+                          <w:rPr>
+                            <w:sz w:val="15"/>
+                          </w:rPr>
+                          <w:t>n</w:t>
                         </w:r>
                         <w:r>
                           <w:rPr>
@@ -20056,11 +20312,19 @@
                             <w:sz w:val="15"/>
                           </w:rPr>
                         </w:pPr>
+                        <w:proofErr w:type="gramStart"/>
                         <w:r>
                           <w:rPr>
                             <w:sz w:val="15"/>
                           </w:rPr>
-                          <w:t>Θ(n</w:t>
+                          <w:t>Θ(</w:t>
+                        </w:r>
+                        <w:proofErr w:type="gramEnd"/>
+                        <w:r>
+                          <w:rPr>
+                            <w:sz w:val="15"/>
+                          </w:rPr>
+                          <w:t>n</w:t>
                         </w:r>
                         <w:r>
                           <w:rPr>
@@ -20089,11 +20353,19 @@
                             <w:sz w:val="15"/>
                           </w:rPr>
                         </w:pPr>
+                        <w:proofErr w:type="gramStart"/>
                         <w:r>
                           <w:rPr>
                             <w:sz w:val="15"/>
                           </w:rPr>
-                          <w:t>O(n</w:t>
+                          <w:t>O(</w:t>
+                        </w:r>
+                        <w:proofErr w:type="gramEnd"/>
+                        <w:r>
+                          <w:rPr>
+                            <w:sz w:val="15"/>
+                          </w:rPr>
+                          <w:t>n</w:t>
                         </w:r>
                         <w:r>
                           <w:rPr>
@@ -20162,11 +20434,19 @@
                             <w:sz w:val="15"/>
                           </w:rPr>
                         </w:pPr>
+                        <w:proofErr w:type="gramStart"/>
                         <w:r>
                           <w:rPr>
                             <w:sz w:val="15"/>
                           </w:rPr>
-                          <w:t>Θ(n</w:t>
+                          <w:t>Θ(</w:t>
+                        </w:r>
+                        <w:proofErr w:type="gramEnd"/>
+                        <w:r>
+                          <w:rPr>
+                            <w:sz w:val="15"/>
+                          </w:rPr>
+                          <w:t>n</w:t>
                         </w:r>
                         <w:r>
                           <w:rPr>
@@ -20195,11 +20475,19 @@
                             <w:sz w:val="15"/>
                           </w:rPr>
                         </w:pPr>
+                        <w:proofErr w:type="gramStart"/>
                         <w:r>
                           <w:rPr>
                             <w:sz w:val="15"/>
                           </w:rPr>
-                          <w:t>O(n</w:t>
+                          <w:t>O(</w:t>
+                        </w:r>
+                        <w:proofErr w:type="gramEnd"/>
+                        <w:r>
+                          <w:rPr>
+                            <w:sz w:val="15"/>
+                          </w:rPr>
+                          <w:t>n</w:t>
                         </w:r>
                         <w:r>
                           <w:rPr>
@@ -20248,11 +20536,19 @@
                             <w:sz w:val="15"/>
                           </w:rPr>
                         </w:pPr>
+                        <w:proofErr w:type="gramStart"/>
                         <w:r>
                           <w:rPr>
                             <w:sz w:val="15"/>
                           </w:rPr>
-                          <w:t>Ω(n</w:t>
+                          <w:t>Ω(</w:t>
+                        </w:r>
+                        <w:proofErr w:type="gramEnd"/>
+                        <w:r>
+                          <w:rPr>
+                            <w:sz w:val="15"/>
+                          </w:rPr>
+                          <w:t>n</w:t>
                         </w:r>
                         <w:r>
                           <w:rPr>
@@ -20281,11 +20577,19 @@
                             <w:sz w:val="15"/>
                           </w:rPr>
                         </w:pPr>
+                        <w:proofErr w:type="gramStart"/>
                         <w:r>
                           <w:rPr>
                             <w:sz w:val="15"/>
                           </w:rPr>
-                          <w:t>Θ(n</w:t>
+                          <w:t>Θ(</w:t>
+                        </w:r>
+                        <w:proofErr w:type="gramEnd"/>
+                        <w:r>
+                          <w:rPr>
+                            <w:sz w:val="15"/>
+                          </w:rPr>
+                          <w:t>n</w:t>
                         </w:r>
                         <w:r>
                           <w:rPr>
@@ -20314,11 +20618,19 @@
                             <w:sz w:val="15"/>
                           </w:rPr>
                         </w:pPr>
+                        <w:proofErr w:type="gramStart"/>
                         <w:r>
                           <w:rPr>
                             <w:sz w:val="15"/>
                           </w:rPr>
-                          <w:t>O(n</w:t>
+                          <w:t>O(</w:t>
+                        </w:r>
+                        <w:proofErr w:type="gramEnd"/>
+                        <w:r>
+                          <w:rPr>
+                            <w:sz w:val="15"/>
+                          </w:rPr>
+                          <w:t>n</w:t>
                         </w:r>
                         <w:r>
                           <w:rPr>
@@ -20347,11 +20659,19 @@
                             <w:sz w:val="15"/>
                           </w:rPr>
                         </w:pPr>
+                        <w:proofErr w:type="gramStart"/>
                         <w:r>
                           <w:rPr>
                             <w:sz w:val="15"/>
                           </w:rPr>
-                          <w:t>O(1)</w:t>
+                          <w:t>O(</w:t>
+                        </w:r>
+                        <w:proofErr w:type="gramEnd"/>
+                        <w:r>
+                          <w:rPr>
+                            <w:sz w:val="15"/>
+                          </w:rPr>
+                          <w:t>1)</w:t>
                         </w:r>
                       </w:p>
                     </w:txbxContent>
@@ -20427,11 +20747,19 @@
                             <w:sz w:val="15"/>
                           </w:rPr>
                         </w:pPr>
+                        <w:proofErr w:type="gramStart"/>
                         <w:r>
                           <w:rPr>
                             <w:sz w:val="15"/>
                           </w:rPr>
-                          <w:t>O(1)</w:t>
+                          <w:t>O(</w:t>
+                        </w:r>
+                        <w:proofErr w:type="gramEnd"/>
+                        <w:r>
+                          <w:rPr>
+                            <w:sz w:val="15"/>
+                          </w:rPr>
+                          <w:t>1)</w:t>
                         </w:r>
                       </w:p>
                     </w:txbxContent>
@@ -20507,11 +20835,19 @@
                             <w:sz w:val="15"/>
                           </w:rPr>
                         </w:pPr>
+                        <w:proofErr w:type="gramStart"/>
                         <w:r>
                           <w:rPr>
                             <w:sz w:val="15"/>
                           </w:rPr>
-                          <w:t>O(1)</w:t>
+                          <w:t>O(</w:t>
+                        </w:r>
+                        <w:proofErr w:type="gramEnd"/>
+                        <w:r>
+                          <w:rPr>
+                            <w:sz w:val="15"/>
+                          </w:rPr>
+                          <w:t>1)</w:t>
                         </w:r>
                       </w:p>
                     </w:txbxContent>
@@ -20587,11 +20923,19 @@
                             <w:sz w:val="15"/>
                           </w:rPr>
                         </w:pPr>
+                        <w:proofErr w:type="gramStart"/>
                         <w:r>
                           <w:rPr>
                             <w:sz w:val="15"/>
                           </w:rPr>
-                          <w:t>O(1)</w:t>
+                          <w:t>O(</w:t>
+                        </w:r>
+                        <w:proofErr w:type="gramEnd"/>
+                        <w:r>
+                          <w:rPr>
+                            <w:sz w:val="15"/>
+                          </w:rPr>
+                          <w:t>1)</w:t>
                         </w:r>
                       </w:p>
                     </w:txbxContent>
@@ -20607,11 +20951,19 @@
                             <w:sz w:val="15"/>
                           </w:rPr>
                         </w:pPr>
+                        <w:proofErr w:type="gramStart"/>
                         <w:r>
                           <w:rPr>
                             <w:sz w:val="15"/>
                           </w:rPr>
-                          <w:t>Ω(n</w:t>
+                          <w:t>Ω(</w:t>
+                        </w:r>
+                        <w:proofErr w:type="gramEnd"/>
+                        <w:r>
+                          <w:rPr>
+                            <w:sz w:val="15"/>
+                          </w:rPr>
+                          <w:t>n</w:t>
                         </w:r>
                         <w:r>
                           <w:rPr>
@@ -20640,11 +20992,19 @@
                             <w:sz w:val="15"/>
                           </w:rPr>
                         </w:pPr>
+                        <w:proofErr w:type="gramStart"/>
                         <w:r>
                           <w:rPr>
                             <w:sz w:val="15"/>
                           </w:rPr>
-                          <w:t>Θ(n</w:t>
+                          <w:t>Θ(</w:t>
+                        </w:r>
+                        <w:proofErr w:type="gramEnd"/>
+                        <w:r>
+                          <w:rPr>
+                            <w:sz w:val="15"/>
+                          </w:rPr>
+                          <w:t>n</w:t>
                         </w:r>
                         <w:r>
                           <w:rPr>
@@ -20713,11 +21073,19 @@
                             <w:sz w:val="15"/>
                           </w:rPr>
                         </w:pPr>
+                        <w:proofErr w:type="gramStart"/>
                         <w:r>
                           <w:rPr>
                             <w:sz w:val="15"/>
                           </w:rPr>
-                          <w:t>Ω(n</w:t>
+                          <w:t>Ω(</w:t>
+                        </w:r>
+                        <w:proofErr w:type="gramEnd"/>
+                        <w:r>
+                          <w:rPr>
+                            <w:sz w:val="15"/>
+                          </w:rPr>
+                          <w:t>n</w:t>
                         </w:r>
                         <w:r>
                           <w:rPr>
@@ -20750,7 +21118,21 @@
                           <w:rPr>
                             <w:sz w:val="15"/>
                           </w:rPr>
-                          <w:t>Θ(n(log(n))^2)</w:t>
+                          <w:t>Θ(n(log(n</w:t>
+                        </w:r>
+                        <w:proofErr w:type="gramStart"/>
+                        <w:r>
+                          <w:rPr>
+                            <w:sz w:val="15"/>
+                          </w:rPr>
+                          <w:t>))^</w:t>
+                        </w:r>
+                        <w:proofErr w:type="gramEnd"/>
+                        <w:r>
+                          <w:rPr>
+                            <w:sz w:val="15"/>
+                          </w:rPr>
+                          <w:t>2)</w:t>
                         </w:r>
                       </w:p>
                     </w:txbxContent>
@@ -20770,7 +21152,21 @@
                           <w:rPr>
                             <w:sz w:val="15"/>
                           </w:rPr>
-                          <w:t>O(n(log(n))^2)</w:t>
+                          <w:t>O(n(log(n</w:t>
+                        </w:r>
+                        <w:proofErr w:type="gramStart"/>
+                        <w:r>
+                          <w:rPr>
+                            <w:sz w:val="15"/>
+                          </w:rPr>
+                          <w:t>))^</w:t>
+                        </w:r>
+                        <w:proofErr w:type="gramEnd"/>
+                        <w:r>
+                          <w:rPr>
+                            <w:sz w:val="15"/>
+                          </w:rPr>
+                          <w:t>2)</w:t>
                         </w:r>
                       </w:p>
                     </w:txbxContent>
@@ -20786,11 +21182,19 @@
                             <w:sz w:val="15"/>
                           </w:rPr>
                         </w:pPr>
+                        <w:proofErr w:type="gramStart"/>
                         <w:r>
                           <w:rPr>
                             <w:sz w:val="15"/>
                           </w:rPr>
-                          <w:t>O(1)</w:t>
+                          <w:t>O(</w:t>
+                        </w:r>
+                        <w:proofErr w:type="gramEnd"/>
+                        <w:r>
+                          <w:rPr>
+                            <w:sz w:val="15"/>
+                          </w:rPr>
+                          <w:t>1)</w:t>
                         </w:r>
                       </w:p>
                     </w:txbxContent>
@@ -20810,21 +21214,7 @@
                           <w:rPr>
                             <w:sz w:val="15"/>
                           </w:rPr>
-                          <w:t>Ω(</w:t>
-                        </w:r>
-                        <w:proofErr w:type="spellStart"/>
-                        <w:r>
-                          <w:rPr>
-                            <w:sz w:val="15"/>
-                          </w:rPr>
-                          <w:t>n+k</w:t>
-                        </w:r>
-                        <w:proofErr w:type="spellEnd"/>
-                        <w:r>
-                          <w:rPr>
-                            <w:sz w:val="15"/>
-                          </w:rPr>
-                          <w:t>)</w:t>
+                          <w:t>Ω(n+k)</w:t>
                         </w:r>
                       </w:p>
                     </w:txbxContent>
@@ -20844,21 +21234,7 @@
                           <w:rPr>
                             <w:sz w:val="15"/>
                           </w:rPr>
-                          <w:t>Θ(</w:t>
-                        </w:r>
-                        <w:proofErr w:type="spellStart"/>
-                        <w:r>
-                          <w:rPr>
-                            <w:sz w:val="15"/>
-                          </w:rPr>
-                          <w:t>n+k</w:t>
-                        </w:r>
-                        <w:proofErr w:type="spellEnd"/>
-                        <w:r>
-                          <w:rPr>
-                            <w:sz w:val="15"/>
-                          </w:rPr>
-                          <w:t>)</w:t>
+                          <w:t>Θ(n+k)</w:t>
                         </w:r>
                       </w:p>
                     </w:txbxContent>
@@ -20918,21 +21294,7 @@
                           <w:rPr>
                             <w:sz w:val="15"/>
                           </w:rPr>
-                          <w:t>Ω(</w:t>
-                        </w:r>
-                        <w:proofErr w:type="spellStart"/>
-                        <w:r>
-                          <w:rPr>
-                            <w:sz w:val="15"/>
-                          </w:rPr>
-                          <w:t>nk</w:t>
-                        </w:r>
-                        <w:proofErr w:type="spellEnd"/>
-                        <w:r>
-                          <w:rPr>
-                            <w:sz w:val="15"/>
-                          </w:rPr>
-                          <w:t>)</w:t>
+                          <w:t>Ω(nk)</w:t>
                         </w:r>
                       </w:p>
                     </w:txbxContent>
@@ -20952,21 +21314,7 @@
                           <w:rPr>
                             <w:sz w:val="15"/>
                           </w:rPr>
-                          <w:t>Θ(</w:t>
-                        </w:r>
-                        <w:proofErr w:type="spellStart"/>
-                        <w:r>
-                          <w:rPr>
-                            <w:sz w:val="15"/>
-                          </w:rPr>
-                          <w:t>nk</w:t>
-                        </w:r>
-                        <w:proofErr w:type="spellEnd"/>
-                        <w:r>
-                          <w:rPr>
-                            <w:sz w:val="15"/>
-                          </w:rPr>
-                          <w:t>)</w:t>
+                          <w:t>Θ(nk)</w:t>
                         </w:r>
                       </w:p>
                     </w:txbxContent>
@@ -20986,21 +21334,7 @@
                           <w:rPr>
                             <w:sz w:val="15"/>
                           </w:rPr>
-                          <w:t>O(</w:t>
-                        </w:r>
-                        <w:proofErr w:type="spellStart"/>
-                        <w:r>
-                          <w:rPr>
-                            <w:sz w:val="15"/>
-                          </w:rPr>
-                          <w:t>nk</w:t>
-                        </w:r>
-                        <w:proofErr w:type="spellEnd"/>
-                        <w:r>
-                          <w:rPr>
-                            <w:sz w:val="15"/>
-                          </w:rPr>
-                          <w:t>)</w:t>
+                          <w:t>O(nk)</w:t>
                         </w:r>
                       </w:p>
                     </w:txbxContent>
@@ -21020,21 +21354,7 @@
                           <w:rPr>
                             <w:sz w:val="15"/>
                           </w:rPr>
-                          <w:t>O(</w:t>
-                        </w:r>
-                        <w:proofErr w:type="spellStart"/>
-                        <w:r>
-                          <w:rPr>
-                            <w:sz w:val="15"/>
-                          </w:rPr>
-                          <w:t>n+k</w:t>
-                        </w:r>
-                        <w:proofErr w:type="spellEnd"/>
-                        <w:r>
-                          <w:rPr>
-                            <w:sz w:val="15"/>
-                          </w:rPr>
-                          <w:t>)</w:t>
+                          <w:t>O(n+k)</w:t>
                         </w:r>
                       </w:p>
                     </w:txbxContent>
@@ -21054,21 +21374,7 @@
                           <w:rPr>
                             <w:sz w:val="15"/>
                           </w:rPr>
-                          <w:t>Ω(</w:t>
-                        </w:r>
-                        <w:proofErr w:type="spellStart"/>
-                        <w:r>
-                          <w:rPr>
-                            <w:sz w:val="15"/>
-                          </w:rPr>
-                          <w:t>n+k</w:t>
-                        </w:r>
-                        <w:proofErr w:type="spellEnd"/>
-                        <w:r>
-                          <w:rPr>
-                            <w:sz w:val="15"/>
-                          </w:rPr>
-                          <w:t>)</w:t>
+                          <w:t>Ω(n+k)</w:t>
                         </w:r>
                       </w:p>
                     </w:txbxContent>
@@ -21088,21 +21394,7 @@
                           <w:rPr>
                             <w:sz w:val="15"/>
                           </w:rPr>
-                          <w:t>Θ(</w:t>
-                        </w:r>
-                        <w:proofErr w:type="spellStart"/>
-                        <w:r>
-                          <w:rPr>
-                            <w:sz w:val="15"/>
-                          </w:rPr>
-                          <w:t>n+k</w:t>
-                        </w:r>
-                        <w:proofErr w:type="spellEnd"/>
-                        <w:r>
-                          <w:rPr>
-                            <w:sz w:val="15"/>
-                          </w:rPr>
-                          <w:t>)</w:t>
+                          <w:t>Θ(n+k)</w:t>
                         </w:r>
                       </w:p>
                     </w:txbxContent>
@@ -21122,21 +21414,7 @@
                           <w:rPr>
                             <w:sz w:val="15"/>
                           </w:rPr>
-                          <w:t>O(</w:t>
-                        </w:r>
-                        <w:proofErr w:type="spellStart"/>
-                        <w:r>
-                          <w:rPr>
-                            <w:sz w:val="15"/>
-                          </w:rPr>
-                          <w:t>n+k</w:t>
-                        </w:r>
-                        <w:proofErr w:type="spellEnd"/>
-                        <w:r>
-                          <w:rPr>
-                            <w:sz w:val="15"/>
-                          </w:rPr>
-                          <w:t>)</w:t>
+                          <w:t>O(n+k)</w:t>
                         </w:r>
                       </w:p>
                     </w:txbxContent>
@@ -21192,11 +21470,19 @@
                             <w:sz w:val="15"/>
                           </w:rPr>
                         </w:pPr>
+                        <w:proofErr w:type="gramStart"/>
                         <w:r>
                           <w:rPr>
                             <w:sz w:val="15"/>
                           </w:rPr>
-                          <w:t>Θ(n</w:t>
+                          <w:t>Θ(</w:t>
+                        </w:r>
+                        <w:proofErr w:type="gramEnd"/>
+                        <w:r>
+                          <w:rPr>
+                            <w:sz w:val="15"/>
+                          </w:rPr>
+                          <w:t>n</w:t>
                         </w:r>
                         <w:r>
                           <w:rPr>
@@ -21225,11 +21511,19 @@
                             <w:sz w:val="15"/>
                           </w:rPr>
                         </w:pPr>
+                        <w:proofErr w:type="gramStart"/>
                         <w:r>
                           <w:rPr>
                             <w:sz w:val="15"/>
                           </w:rPr>
-                          <w:t>O(n</w:t>
+                          <w:t>O(</w:t>
+                        </w:r>
+                        <w:proofErr w:type="gramEnd"/>
+                        <w:r>
+                          <w:rPr>
+                            <w:sz w:val="15"/>
+                          </w:rPr>
+                          <w:t>n</w:t>
                         </w:r>
                         <w:r>
                           <w:rPr>
@@ -21295,7 +21589,7 @@
 </file>
 
 <file path=word/numbering.xml><?xml version="1.0" encoding="utf-8"?>
-<w:numbering xmlns:wpc="http://schemas.microsoft.com/office/word/2010/wordprocessingCanvas" xmlns:cx="http://schemas.microsoft.com/office/drawing/2014/chartex" xmlns:cx1="http://schemas.microsoft.com/office/drawing/2015/9/8/chartex" xmlns:cx2="http://schemas.microsoft.com/office/drawing/2015/10/21/chartex" xmlns:cx3="http://schemas.microsoft.com/office/drawing/2016/5/9/chartex" xmlns:cx4="http://schemas.microsoft.com/office/drawing/2016/5/10/chartex" xmlns:cx5="http://schemas.microsoft.com/office/drawing/2016/5/11/chartex" xmlns:cx6="http://schemas.microsoft.com/office/drawing/2016/5/12/chartex" xmlns:cx7="http://schemas.microsoft.com/office/drawing/2016/5/13/chartex" xmlns:cx8="http://schemas.microsoft.com/office/drawing/2016/5/14/chartex" xmlns:mc="http://schemas.openxmlformats.org/markup-compatibility/2006" xmlns:aink="http://schemas.microsoft.com/office/drawing/2016/ink" xmlns:am3d="http://schemas.microsoft.com/office/drawing/2017/model3d" xmlns:o="urn:schemas-microsoft-com:office:office" xmlns:r="http://schemas.openxmlformats.org/officeDocument/2006/relationships" xmlns:m="http://schemas.openxmlformats.org/officeDocument/2006/math" xmlns:v="urn:schemas-microsoft-com:vml" xmlns:wp14="http://schemas.microsoft.com/office/word/2010/wordprocessingDrawing" xmlns:wp="http://schemas.openxmlformats.org/drawingml/2006/wordprocessingDrawing" xmlns:w10="urn:schemas-microsoft-com:office:word" xmlns:w="http://schemas.openxmlformats.org/wordprocessingml/2006/main" xmlns:w14="http://schemas.microsoft.com/office/word/2010/wordml" xmlns:w15="http://schemas.microsoft.com/office/word/2012/wordml" xmlns:w16cex="http://schemas.microsoft.com/office/word/2018/wordml/cex" xmlns:w16cid="http://schemas.microsoft.com/office/word/2016/wordml/cid" xmlns:w16="http://schemas.microsoft.com/office/word/2018/wordml" xmlns:w16se="http://schemas.microsoft.com/office/word/2015/wordml/symex" xmlns:wpg="http://schemas.microsoft.com/office/word/2010/wordprocessingGroup" xmlns:wpi="http://schemas.microsoft.com/office/word/2010/wordprocessingInk" xmlns:wne="http://schemas.microsoft.com/office/word/2006/wordml" xmlns:wps="http://schemas.microsoft.com/office/word/2010/wordprocessingShape" mc:Ignorable="w14 w15 w16se w16cid w16 w16cex wp14">
+<w:numbering xmlns:wpc="http://schemas.microsoft.com/office/word/2010/wordprocessingCanvas" xmlns:cx="http://schemas.microsoft.com/office/drawing/2014/chartex" xmlns:cx1="http://schemas.microsoft.com/office/drawing/2015/9/8/chartex" xmlns:cx2="http://schemas.microsoft.com/office/drawing/2015/10/21/chartex" xmlns:cx3="http://schemas.microsoft.com/office/drawing/2016/5/9/chartex" xmlns:cx4="http://schemas.microsoft.com/office/drawing/2016/5/10/chartex" xmlns:cx5="http://schemas.microsoft.com/office/drawing/2016/5/11/chartex" xmlns:cx6="http://schemas.microsoft.com/office/drawing/2016/5/12/chartex" xmlns:cx7="http://schemas.microsoft.com/office/drawing/2016/5/13/chartex" xmlns:cx8="http://schemas.microsoft.com/office/drawing/2016/5/14/chartex" xmlns:mc="http://schemas.openxmlformats.org/markup-compatibility/2006" xmlns:aink="http://schemas.microsoft.com/office/drawing/2016/ink" xmlns:am3d="http://schemas.microsoft.com/office/drawing/2017/model3d" xmlns:o="urn:schemas-microsoft-com:office:office" xmlns:r="http://schemas.openxmlformats.org/officeDocument/2006/relationships" xmlns:m="http://schemas.openxmlformats.org/officeDocument/2006/math" xmlns:v="urn:schemas-microsoft-com:vml" xmlns:wp14="http://schemas.microsoft.com/office/word/2010/wordprocessingDrawing" xmlns:wp="http://schemas.openxmlformats.org/drawingml/2006/wordprocessingDrawing" xmlns:w10="urn:schemas-microsoft-com:office:word" xmlns:w="http://schemas.openxmlformats.org/wordprocessingml/2006/main" xmlns:w14="http://schemas.microsoft.com/office/word/2010/wordml" xmlns:w15="http://schemas.microsoft.com/office/word/2012/wordml" xmlns:w16cex="http://schemas.microsoft.com/office/word/2018/wordml/cex" xmlns:w16cid="http://schemas.microsoft.com/office/word/2016/wordml/cid" xmlns:w16="http://schemas.microsoft.com/office/word/2018/wordml" xmlns:w16sdtdh="http://schemas.microsoft.com/office/word/2020/wordml/sdtdatahash" xmlns:w16se="http://schemas.microsoft.com/office/word/2015/wordml/symex" xmlns:wpg="http://schemas.microsoft.com/office/word/2010/wordprocessingGroup" xmlns:wpi="http://schemas.microsoft.com/office/word/2010/wordprocessingInk" xmlns:wne="http://schemas.microsoft.com/office/word/2006/wordml" xmlns:wps="http://schemas.microsoft.com/office/word/2010/wordprocessingShape" mc:Ignorable="w14 w15 w16se w16cid w16 w16cex w16sdtdh wp14">
   <w:abstractNum w:abstractNumId="0" w15:restartNumberingAfterBreak="0">
     <w:nsid w:val="0D1F7D73"/>
     <w:multiLevelType w:val="hybridMultilevel"/>
@@ -21636,7 +21930,7 @@
 </file>
 
 <file path=word/styles.xml><?xml version="1.0" encoding="utf-8"?>
-<w:styles xmlns:mc="http://schemas.openxmlformats.org/markup-compatibility/2006" xmlns:r="http://schemas.openxmlformats.org/officeDocument/2006/relationships" xmlns:w="http://schemas.openxmlformats.org/wordprocessingml/2006/main" xmlns:w14="http://schemas.microsoft.com/office/word/2010/wordml" xmlns:w15="http://schemas.microsoft.com/office/word/2012/wordml" xmlns:w16cex="http://schemas.microsoft.com/office/word/2018/wordml/cex" xmlns:w16cid="http://schemas.microsoft.com/office/word/2016/wordml/cid" xmlns:w16="http://schemas.microsoft.com/office/word/2018/wordml" xmlns:w16se="http://schemas.microsoft.com/office/word/2015/wordml/symex" mc:Ignorable="w14 w15 w16se w16cid w16 w16cex">
+<w:styles xmlns:mc="http://schemas.openxmlformats.org/markup-compatibility/2006" xmlns:r="http://schemas.openxmlformats.org/officeDocument/2006/relationships" xmlns:w="http://schemas.openxmlformats.org/wordprocessingml/2006/main" xmlns:w14="http://schemas.microsoft.com/office/word/2010/wordml" xmlns:w15="http://schemas.microsoft.com/office/word/2012/wordml" xmlns:w16cex="http://schemas.microsoft.com/office/word/2018/wordml/cex" xmlns:w16cid="http://schemas.microsoft.com/office/word/2016/wordml/cid" xmlns:w16="http://schemas.microsoft.com/office/word/2018/wordml" xmlns:w16sdtdh="http://schemas.microsoft.com/office/word/2020/wordml/sdtdatahash" xmlns:w16se="http://schemas.microsoft.com/office/word/2015/wordml/symex" mc:Ignorable="w14 w15 w16se w16cid w16 w16cex w16sdtdh">
   <w:docDefaults>
     <w:rPrDefault>
       <w:rPr>

</xml_diff>